<commit_message>
Update Skills section: remove JavaScript, Tailwind, React, Next, Node, Express, REST APIs, PostgreSQL, SQLite
</commit_message>
<xml_diff>
--- a/Kunal_M_Shende_Resume.docx
+++ b/Kunal_M_Shende_Resume.docx
@@ -139,7 +139,7 @@
           <w:i w:val="0"/>
           <w:sz w:val="19"/>
         </w:rPr>
-        <w:t>Computer Science undergraduate with 2+ years of hands-on experience in embedded systems, IoT hardware security, and full-stack web development. Built ZeroTrace, an ESP32-S3 cybersecurity audit device featuring real-time RF spectrum analysis and USB-HID automation, which won 2nd Prize among 50+ teams at a national-level competition. Holds an Indian Design Patent filing (Application No: 499678-001). Skilled in vulnerability assessment, penetration testing, and delivering scalable web platforms with React.js, Next.js, Node.js, and Python Flask.</w:t>
+        <w:t>Computer Science undergraduate with 2+ years of hands-on experience in embedded systems, IoT hardware security, and full-stack web development. Built ZeroTrace, an ESP32-S3 cybersecurity audit device featuring real-time RF spectrum analysis and USB-HID automation, which won 2nd Prize among 50+ teams at a national-level competition. Holds an Indian Design Patent filing (Application No: 499678-001). Skilled in vulnerability assessment, penetration testing, and delivering scalable web platforms with Python Flask, HTML5/CSS3, and cloud integrations.</w:t>
       </w:r>
     </w:p>
     <w:p>
@@ -180,7 +180,7 @@
           <w:i w:val="0"/>
           <w:sz w:val="19"/>
         </w:rPr>
-        <w:t>C, Embedded C, C++, Python, JavaScript, TypeScript, Bash</w:t>
+        <w:t>C, Embedded C, C++, Python, TypeScript, Bash</w:t>
       </w:r>
     </w:p>
     <w:p>
@@ -228,7 +228,7 @@
           <w:i w:val="0"/>
           <w:sz w:val="19"/>
         </w:rPr>
-        <w:t>HTML5, CSS3, React.js, Next.js, Bootstrap, Tailwind CSS</w:t>
+        <w:t>HTML5, CSS3, Bootstrap</w:t>
       </w:r>
     </w:p>
     <w:p>
@@ -252,7 +252,7 @@
           <w:i w:val="0"/>
           <w:sz w:val="19"/>
         </w:rPr>
-        <w:t>Python Flask, Node.js, Express.js, WebSockets, Firebase, REST APIs</w:t>
+        <w:t>Python Flask, WebSockets, Firebase</w:t>
       </w:r>
     </w:p>
     <w:p>
@@ -276,7 +276,7 @@
           <w:i w:val="0"/>
           <w:sz w:val="19"/>
         </w:rPr>
-        <w:t>MySQL, PostgreSQL, Supabase, Firebase Firestore, SQLite</w:t>
+        <w:t>MySQL, Supabase, Firebase Firestore</w:t>
       </w:r>
     </w:p>
     <w:p>

</xml_diff>

<commit_message>
Update CV: tone down virtual internships to foundational modules, sync CV copies
</commit_message>
<xml_diff>
--- a/Kunal_M_Shende_Resume.docx
+++ b/Kunal_M_Shende_Resume.docx
@@ -569,7 +569,7 @@
           <w:i w:val="0"/>
           <w:sz w:val="20"/>
         </w:rPr>
-        <w:t>Java Full Stack Developer Intern</w:t>
+        <w:t>Java Full Stack Developer Virtual Intern</w:t>
       </w:r>
       <w:r>
         <w:rPr>
@@ -605,23 +605,7 @@
           <w:i w:val="0"/>
           <w:sz w:val="19"/>
         </w:rPr>
-        <w:t>Constructed 2 full-stack web applications serving 15+ REST API endpoints connected to relational databases with Spring Boot.</w:t>
-      </w:r>
-    </w:p>
-    <w:p>
-      <w:pPr>
-        <w:pStyle w:val="ListBullet"/>
-        <w:spacing w:before="0" w:after="20"/>
-        <w:ind w:left="340"/>
-      </w:pPr>
-      <w:r>
-        <w:rPr>
-          <w:rFonts w:ascii="Calibri" w:hAnsi="Calibri"/>
-          <w:b w:val="0"/>
-          <w:i w:val="0"/>
-          <w:sz w:val="19"/>
-        </w:rPr>
-        <w:t>Improved database query response times by 20% through indexing optimization, supporting 500+ daily active users.</w:t>
+        <w:t>Completed hands-on coursework in full-stack application development, database integration, and backend service fundamentals.</w:t>
       </w:r>
     </w:p>
     <w:p>
@@ -635,7 +619,7 @@
           <w:i w:val="0"/>
           <w:sz w:val="20"/>
         </w:rPr>
-        <w:t>Cloud Architect Intern</w:t>
+        <w:t>Cloud Virtual Intern</w:t>
       </w:r>
       <w:r>
         <w:rPr>
@@ -671,23 +655,7 @@
           <w:i w:val="0"/>
           <w:sz w:val="19"/>
         </w:rPr>
-        <w:t>Provisioned 10+ AWS services (EC2, S3, VPC, IAM) to support scalable cloud-native application architectures.</w:t>
-      </w:r>
-    </w:p>
-    <w:p>
-      <w:pPr>
-        <w:pStyle w:val="ListBullet"/>
-        <w:spacing w:before="0" w:after="20"/>
-        <w:ind w:left="340"/>
-      </w:pPr>
-      <w:r>
-        <w:rPr>
-          <w:rFonts w:ascii="Calibri" w:hAnsi="Calibri"/>
-          <w:b w:val="0"/>
-          <w:i w:val="0"/>
-          <w:sz w:val="19"/>
-        </w:rPr>
-        <w:t>Shortened manual infrastructure setup time by 60% through CloudFormation template automation.</w:t>
+        <w:t>Studied cloud computing architectures, covering fundamental AWS infrastructure services including EC2, S3, VPC, and IAM.</w:t>
       </w:r>
     </w:p>
     <w:p>
@@ -701,7 +669,7 @@
           <w:i w:val="0"/>
           <w:sz w:val="20"/>
         </w:rPr>
-        <w:t>Android Developer Intern</w:t>
+        <w:t>Android Developer Virtual Intern</w:t>
       </w:r>
       <w:r>
         <w:rPr>
@@ -737,23 +705,7 @@
           <w:i w:val="0"/>
           <w:sz w:val="19"/>
         </w:rPr>
-        <w:t>Delivered 2 native Android applications with Material Design UI, background services, and offline-first SQLite caching.</w:t>
-      </w:r>
-    </w:p>
-    <w:p>
-      <w:pPr>
-        <w:pStyle w:val="ListBullet"/>
-        <w:spacing w:before="0" w:after="20"/>
-        <w:ind w:left="340"/>
-      </w:pPr>
-      <w:r>
-        <w:rPr>
-          <w:rFonts w:ascii="Calibri" w:hAnsi="Calibri"/>
-          <w:b w:val="0"/>
-          <w:i w:val="0"/>
-          <w:sz w:val="19"/>
-        </w:rPr>
-        <w:t>Handled 1,000+ daily API synchronization requests with 99.5% uptime through robust RESTful communication layers.</w:t>
+        <w:t>Explored native Android application fundamentals, Material Design interface principles, and local SQLite data storage.</w:t>
       </w:r>
     </w:p>
     <w:p>

</xml_diff>

<commit_message>
ATS optimization: quantified bullets, consistent structure, standard headers, labeled contacts
</commit_message>
<xml_diff>
--- a/Kunal_M_Shende_Resume.docx
+++ b/Kunal_M_Shende_Resume.docx
@@ -29,7 +29,7 @@
           <w:color w:val="505050"/>
           <w:sz w:val="20"/>
         </w:rPr>
-        <w:t>Software Engineer | IoT Developer | Cybersecurity Researcher</w:t>
+        <w:t>Embedded Systems Engineer | IoT Security Researcher | Cybersecurity Analyst</w:t>
       </w:r>
     </w:p>
     <w:p>
@@ -44,7 +44,7 @@
           <w:color w:val="3C3C3C"/>
           <w:sz w:val="18"/>
         </w:rPr>
-        <w:t xml:space="preserve">+91 8767755741 | </w:t>
+        <w:t xml:space="preserve">Phone: +91 8767755741 | Email: </w:t>
       </w:r>
       <w:hyperlink r:id="rId9">
         <w:r>
@@ -64,13 +64,23 @@
           <w:color w:val="3C3C3C"/>
           <w:sz w:val="18"/>
         </w:rPr>
-        <w:t xml:space="preserve"> | Nagpur, Maharashtra, India</w:t>
+        <w:t xml:space="preserve"> | Location: Nagpur, Maharashtra, India</w:t>
       </w:r>
     </w:p>
     <w:p>
       <w:pPr>
         <w:jc w:val="center"/>
       </w:pPr>
+      <w:r>
+        <w:rPr>
+          <w:rFonts w:ascii="Calibri" w:hAnsi="Calibri"/>
+          <w:b w:val="0"/>
+          <w:i w:val="0"/>
+          <w:color w:val="3C3C3C"/>
+          <w:sz w:val="18"/>
+        </w:rPr>
+        <w:t xml:space="preserve">LinkedIn: </w:t>
+      </w:r>
       <w:hyperlink r:id="rId10">
         <w:r>
           <w:rPr>
@@ -83,7 +93,14 @@
         </w:r>
       </w:hyperlink>
       <w:r>
-        <w:t xml:space="preserve">  |  </w:t>
+        <w:rPr>
+          <w:rFonts w:ascii="Calibri" w:hAnsi="Calibri"/>
+          <w:b w:val="0"/>
+          <w:i w:val="0"/>
+          <w:color w:val="3C3C3C"/>
+          <w:sz w:val="18"/>
+        </w:rPr>
+        <w:t xml:space="preserve"> | GitHub: </w:t>
       </w:r>
       <w:hyperlink r:id="rId11">
         <w:r>
@@ -97,7 +114,14 @@
         </w:r>
       </w:hyperlink>
       <w:r>
-        <w:t xml:space="preserve">  |  </w:t>
+        <w:rPr>
+          <w:rFonts w:ascii="Calibri" w:hAnsi="Calibri"/>
+          <w:b w:val="0"/>
+          <w:i w:val="0"/>
+          <w:color w:val="3C3C3C"/>
+          <w:sz w:val="18"/>
+        </w:rPr>
+        <w:t xml:space="preserve"> | Portfolio: </w:t>
       </w:r>
       <w:hyperlink r:id="rId12">
         <w:r>
@@ -125,7 +149,7 @@
           <w:color w:val="000000"/>
           <w:sz w:val="22"/>
         </w:rPr>
-        <w:t>SUMMARY</w:t>
+        <w:t>PROFESSIONAL SUMMARY</w:t>
       </w:r>
     </w:p>
     <w:p>
@@ -139,7 +163,7 @@
           <w:i w:val="0"/>
           <w:sz w:val="19"/>
         </w:rPr>
-        <w:t>Computer Science undergraduate with 2+ years of hands-on experience in embedded systems, IoT hardware security, and full-stack web development. Built ZeroTrace, an ESP32-S3 cybersecurity audit device featuring real-time RF spectrum analysis and USB-HID automation, which won 2nd Prize among 50+ teams at a national-level competition. Holds an Indian Design Patent filing (Application No: 499678-001). Skilled in vulnerability assessment, penetration testing, and delivering scalable web platforms with Python Flask, HTML5/CSS3, and cloud integrations.</w:t>
+        <w:t>Computer Science undergraduate with 2+ years of hands-on experience in embedded systems, IoT hardware security, and web development. Designed ZeroTrace, an ESP32-S3-based cybersecurity audit device featuring 4 security modules and real-time RF spectrum analysis, which won 2nd Prize among 50+ teams at a national-level competition. Filed an Indian Design Patent (Application No. 499678-001). Proficient in vulnerability assessment, penetration testing, firmware development, and deploying scalable web platforms with Python Flask and cloud services.</w:t>
       </w:r>
     </w:p>
     <w:p>
@@ -171,7 +195,7 @@
           <w:i w:val="0"/>
           <w:sz w:val="19"/>
         </w:rPr>
-        <w:t xml:space="preserve">Languages: </w:t>
+        <w:t xml:space="preserve">Programming Languages: </w:t>
       </w:r>
       <w:r>
         <w:rPr>
@@ -195,7 +219,7 @@
           <w:i w:val="0"/>
           <w:sz w:val="19"/>
         </w:rPr>
-        <w:t xml:space="preserve">IoT and Hardware: </w:t>
+        <w:t xml:space="preserve">IoT and Embedded Hardware: </w:t>
       </w:r>
       <w:r>
         <w:rPr>
@@ -219,7 +243,7 @@
           <w:i w:val="0"/>
           <w:sz w:val="19"/>
         </w:rPr>
-        <w:t xml:space="preserve">Frontend: </w:t>
+        <w:t xml:space="preserve">Web Development: </w:t>
       </w:r>
       <w:r>
         <w:rPr>
@@ -228,31 +252,7 @@
           <w:i w:val="0"/>
           <w:sz w:val="19"/>
         </w:rPr>
-        <w:t>HTML5, CSS3, Bootstrap</w:t>
-      </w:r>
-    </w:p>
-    <w:p>
-      <w:pPr>
-        <w:spacing w:before="0" w:after="20"/>
-        <w:ind w:left="170"/>
-      </w:pPr>
-      <w:r>
-        <w:rPr>
-          <w:rFonts w:ascii="Calibri" w:hAnsi="Calibri"/>
-          <w:b/>
-          <w:i w:val="0"/>
-          <w:sz w:val="19"/>
-        </w:rPr>
-        <w:t xml:space="preserve">Backend: </w:t>
-      </w:r>
-      <w:r>
-        <w:rPr>
-          <w:rFonts w:ascii="Calibri" w:hAnsi="Calibri"/>
-          <w:b w:val="0"/>
-          <w:i w:val="0"/>
-          <w:sz w:val="19"/>
-        </w:rPr>
-        <w:t>Python Flask, WebSockets, Firebase</w:t>
+        <w:t>HTML5, CSS3, Bootstrap, Python Flask, WebSockets, Firebase</w:t>
       </w:r>
     </w:p>
     <w:p>
@@ -291,7 +291,7 @@
           <w:i w:val="0"/>
           <w:sz w:val="19"/>
         </w:rPr>
-        <w:t xml:space="preserve">Security Tools: </w:t>
+        <w:t xml:space="preserve">Cybersecurity Tools: </w:t>
       </w:r>
       <w:r>
         <w:rPr>
@@ -315,7 +315,7 @@
           <w:i w:val="0"/>
           <w:sz w:val="19"/>
         </w:rPr>
-        <w:t xml:space="preserve">DevOps and Tools: </w:t>
+        <w:t xml:space="preserve">DevOps and Cloud: </w:t>
       </w:r>
       <w:r>
         <w:rPr>
@@ -324,7 +324,7 @@
           <w:i w:val="0"/>
           <w:sz w:val="19"/>
         </w:rPr>
-        <w:t>Git, GitHub, Docker, Vercel, Google Cloud, VS Code, Postman</w:t>
+        <w:t>Git, GitHub, Docker, Vercel, Google Cloud Platform, VS Code, Postman</w:t>
       </w:r>
     </w:p>
     <w:p>
@@ -341,7 +341,7 @@
           <w:color w:val="000000"/>
           <w:sz w:val="22"/>
         </w:rPr>
-        <w:t>EXPERIENCE</w:t>
+        <w:t>WORK EXPERIENCE</w:t>
       </w:r>
     </w:p>
     <w:p>
@@ -391,7 +391,7 @@
           <w:i w:val="0"/>
           <w:sz w:val="19"/>
         </w:rPr>
-        <w:t>Architected 3 secure IoT prototypes on ESP32-S3 and ATmega328P, reducing firmware attack surfaces by 40% through memory protection techniques.</w:t>
+        <w:t>Architected 3 secure IoT prototypes on ESP32-S3 and ATmega328P platforms, reducing firmware attack surfaces by 40% through memory-safe coding practices.</w:t>
       </w:r>
     </w:p>
     <w:p>
@@ -407,7 +407,7 @@
           <w:i w:val="0"/>
           <w:sz w:val="19"/>
         </w:rPr>
-        <w:t>Identified 15+ critical vulnerabilities across 10+ controlled environments using OWASP and NIST assessment methodologies.</w:t>
+        <w:t>Discovered 15+ critical vulnerabilities across 10 controlled environments by applying OWASP and NIST assessment frameworks.</w:t>
       </w:r>
     </w:p>
     <w:p>
@@ -423,7 +423,7 @@
           <w:i w:val="0"/>
           <w:sz w:val="19"/>
         </w:rPr>
-        <w:t>Lowered network security anomalies by 25% through traffic analysis and proactive system hardening across 5 IoT deployments.</w:t>
+        <w:t>Mitigated 25% of network security anomalies through packet-level traffic analysis and proactive system hardening across 5 IoT deployments.</w:t>
       </w:r>
     </w:p>
     <w:p>
@@ -473,7 +473,7 @@
           <w:i w:val="0"/>
           <w:sz w:val="19"/>
         </w:rPr>
-        <w:t>Uncovered 12 security flaws including SQL injection and XSS across 8 web applications during structured penetration testing exercises.</w:t>
+        <w:t>Detected 12 security flaws including SQL injection and cross-site scripting across 8 web applications during structured penetration testing exercises.</w:t>
       </w:r>
     </w:p>
     <w:p>
@@ -489,7 +489,7 @@
           <w:i w:val="0"/>
           <w:sz w:val="19"/>
         </w:rPr>
-        <w:t>Accelerated patch deployment timelines by 30% by compiling detailed remediation reports for the development team.</w:t>
+        <w:t>Accelerated remediation cycles by 30% through compiling vulnerability reports with severity classification and proof-of-concept documentation.</w:t>
       </w:r>
     </w:p>
     <w:p>
@@ -513,7 +513,7 @@
           <w:color w:val="505050"/>
           <w:sz w:val="19"/>
         </w:rPr>
-        <w:t xml:space="preserve"> | Palo Alto Networks / EduSkills</w:t>
+        <w:t xml:space="preserve"> | Palo Alto Networks and EduSkills</w:t>
       </w:r>
       <w:r>
         <w:rPr>
@@ -539,7 +539,7 @@
           <w:i w:val="0"/>
           <w:sz w:val="19"/>
         </w:rPr>
-        <w:t>Examined 500+ packet captures and firewall configurations, strengthening endpoint protection across 3 multi-cloud environments.</w:t>
+        <w:t>Analyzed 500+ network packet captures and firewall rule sets, strengthening endpoint protection across 3 multi-cloud environments.</w:t>
       </w:r>
     </w:p>
     <w:p>
@@ -555,7 +555,7 @@
           <w:i w:val="0"/>
           <w:sz w:val="19"/>
         </w:rPr>
-        <w:t>Earned 4 industry certifications (SecOps, Network Security, Cybersecurity, Cloud Security) during the internship period.</w:t>
+        <w:t>Earned 4 industry certifications covering Security Operations, Network Security, Cybersecurity Fundamentals, and Cloud Security from Palo Alto Networks.</w:t>
       </w:r>
     </w:p>
     <w:p>
@@ -605,7 +605,7 @@
           <w:i w:val="0"/>
           <w:sz w:val="19"/>
         </w:rPr>
-        <w:t>Completed hands-on coursework in full-stack application development, database integration, and backend service fundamentals.</w:t>
+        <w:t>Completed 12-week structured coursework covering full-stack application development, relational database integration, and backend service design.</w:t>
       </w:r>
     </w:p>
     <w:p>
@@ -655,7 +655,7 @@
           <w:i w:val="0"/>
           <w:sz w:val="19"/>
         </w:rPr>
-        <w:t>Studied cloud computing architectures, covering fundamental AWS infrastructure services including EC2, S3, VPC, and IAM.</w:t>
+        <w:t>Studied 10+ core AWS infrastructure services including EC2, S3, VPC, and IAM through hands-on lab exercises over 8 weeks.</w:t>
       </w:r>
     </w:p>
     <w:p>
@@ -705,7 +705,7 @@
           <w:i w:val="0"/>
           <w:sz w:val="19"/>
         </w:rPr>
-        <w:t>Explored native Android application fundamentals, Material Design interface principles, and local SQLite data storage.</w:t>
+        <w:t>Explored 8 Android development modules covering Material Design principles, activity lifecycle management, and local SQLite data persistence.</w:t>
       </w:r>
     </w:p>
     <w:p>
@@ -787,7 +787,7 @@
           <w:i w:val="0"/>
           <w:sz w:val="19"/>
         </w:rPr>
-        <w:t>Created an all-in-one embedded audit companion with 4 security modules: RF scanning, Wi-Fi auditing, RSSI foxhunting, and USB-HID injection.</w:t>
+        <w:t>Engineered an all-in-one embedded audit companion integrating 4 security modules: RF scanning, Wi-Fi auditing, RSSI foxhunting, and USB-HID injection.</w:t>
       </w:r>
     </w:p>
     <w:p>
@@ -803,7 +803,7 @@
           <w:i w:val="0"/>
           <w:sz w:val="19"/>
         </w:rPr>
-        <w:t>Achieved 60 FPS display rendering by pinning FreeRTOS tasks across dual CPU cores, cutting frame latency by 35%.</w:t>
+        <w:t>Optimized display rendering to 60 FPS by pinning FreeRTOS tasks across dual CPU cores, cutting frame latency by 35%.</w:t>
       </w:r>
     </w:p>
     <w:p>
@@ -819,7 +819,7 @@
           <w:i w:val="0"/>
           <w:sz w:val="19"/>
         </w:rPr>
-        <w:t>Won 2nd Prize at TECHTANTRA 2K26 national competition among 50+ teams; filed Design Patent (No: 499678-001).</w:t>
+        <w:t>Secured 2nd Prize at TECHTANTRA 2K26 national competition among 50+ teams and filed Design Patent (Application No. 499678-001).</w:t>
       </w:r>
     </w:p>
     <w:p>
@@ -869,7 +869,7 @@
           <w:i w:val="0"/>
           <w:sz w:val="19"/>
         </w:rPr>
-        <w:t>Launched a real-time USB threat detection system that neutralizes rogue HID devices with sub-10ms response time.</w:t>
+        <w:t>Developed a real-time USB threat detection system that neutralizes rogue HID devices within a sub-10-millisecond response window.</w:t>
       </w:r>
     </w:p>
     <w:p>
@@ -885,7 +885,7 @@
           <w:i w:val="0"/>
           <w:sz w:val="19"/>
         </w:rPr>
-        <w:t>Captured 100% of simulated BadUSB attack vectors through automated forensic snapshotting in controlled testing.</w:t>
+        <w:t>Intercepted 100% of simulated BadUSB attack vectors through automated forensic snapshotting in controlled test scenarios.</w:t>
       </w:r>
     </w:p>
     <w:p>
@@ -909,7 +909,7 @@
           <w:color w:val="505050"/>
           <w:sz w:val="19"/>
         </w:rPr>
-        <w:t xml:space="preserve"> | TypeScript, Next.js, Web Serial API</w:t>
+        <w:t xml:space="preserve"> | TypeScript, Web Serial API</w:t>
       </w:r>
       <w:r>
         <w:rPr>
@@ -935,7 +935,7 @@
           <w:i w:val="0"/>
           <w:sz w:val="19"/>
         </w:rPr>
-        <w:t>Released a zero-install browser-based firmware flasher, eliminating native toolchain setup and cutting developer onboarding time by 70%.</w:t>
+        <w:t>Deployed a zero-install browser-based firmware flasher, eliminating native toolchain setup and reducing developer onboarding time by 70%.</w:t>
       </w:r>
     </w:p>
     <w:p>
@@ -1000,7 +1000,7 @@
           <w:i w:val="0"/>
           <w:sz w:val="19"/>
         </w:rPr>
-        <w:t>Assembled a differential-drive robot with hardware PWM calibration at 7.8 kHz, removing motor stalling and reducing audible noise by 90%.</w:t>
+        <w:t>Constructed a differential-drive robot with hardware PWM calibration at 7.8 kHz, eliminating motor stalling and reducing audible noise by 90%.</w:t>
       </w:r>
     </w:p>
     <w:p>
@@ -1016,7 +1016,7 @@
           <w:i w:val="0"/>
           <w:sz w:val="19"/>
         </w:rPr>
-        <w:t>Tuned a proportional control algorithm achieving 95% accuracy on sharp 90-degree corners at competition speed.</w:t>
+        <w:t>Calibrated a proportional control algorithm achieving 95% path-tracking accuracy on sharp 90-degree corners at competition speed.</w:t>
       </w:r>
     </w:p>
     <w:p>
@@ -1049,7 +1049,7 @@
           <w:i w:val="0"/>
           <w:sz w:val="19"/>
         </w:rPr>
-        <w:t>Secured 2nd Prize at TECHTANTRA 2K26 National Level Technical Competition among 50+ teams for the ZeroTrace project.</w:t>
+        <w:t>Secured 2nd Prize at TECHTANTRA 2K26 National Level Technical Competition among 50+ participating teams for the ZeroTrace project.</w:t>
       </w:r>
     </w:p>
     <w:p>
@@ -1065,7 +1065,7 @@
           <w:i w:val="0"/>
           <w:sz w:val="19"/>
         </w:rPr>
-        <w:t>Registered Indian Design Patent (Application No: 499678-001, CBR NO: 209757) in April 2026 for ZeroTrace hardware.</w:t>
+        <w:t>Filed Indian Design Patent (Application No. 499678-001, CBR No. 209757) in April 2026 for ZeroTrace hardware design.</w:t>
       </w:r>
     </w:p>
     <w:p>
@@ -1096,7 +1096,7 @@
           <w:i w:val="0"/>
           <w:sz w:val="20"/>
         </w:rPr>
-        <w:t>B.Tech in Computer Science and Engineering</w:t>
+        <w:t>Bachelor of Technology in Computer Science and Engineering</w:t>
       </w:r>
       <w:r>
         <w:rPr>
@@ -1116,7 +1116,7 @@
           <w:color w:val="646464"/>
           <w:sz w:val="19"/>
         </w:rPr>
-        <w:t xml:space="preserve"> | 2023 - 2027</w:t>
+        <w:t xml:space="preserve"> | August 2023 - June 2027</w:t>
       </w:r>
     </w:p>
     <w:p>
@@ -1165,7 +1165,7 @@
           <w:color w:val="646464"/>
           <w:sz w:val="19"/>
         </w:rPr>
-        <w:t xml:space="preserve"> | 2021 - 2023</w:t>
+        <w:t xml:space="preserve"> | June 2021 - March 2023</w:t>
       </w:r>
     </w:p>
     <w:p>
@@ -1199,7 +1199,7 @@
           <w:color w:val="646464"/>
           <w:sz w:val="19"/>
         </w:rPr>
-        <w:t xml:space="preserve"> | 2019 - 2021</w:t>
+        <w:t xml:space="preserve"> | June 2019 - March 2021</w:t>
       </w:r>
     </w:p>
     <w:p>
@@ -1241,7 +1241,7 @@
           <w:color w:val="646464"/>
           <w:sz w:val="18"/>
         </w:rPr>
-        <w:t xml:space="preserve"> | Craw Security / IIT Bombay | 2025-2026</w:t>
+        <w:t xml:space="preserve"> - Craw Security and IIT Bombay, 2025-2026</w:t>
       </w:r>
     </w:p>
     <w:p>
@@ -1266,7 +1266,7 @@
           <w:color w:val="646464"/>
           <w:sz w:val="18"/>
         </w:rPr>
-        <w:t xml:space="preserve"> | NASSCOM FutureSkills Prime | 2025-2026</w:t>
+        <w:t xml:space="preserve"> - NASSCOM FutureSkills Prime, 2025-2026</w:t>
       </w:r>
     </w:p>
     <w:p>
@@ -1291,7 +1291,7 @@
           <w:color w:val="646464"/>
           <w:sz w:val="18"/>
         </w:rPr>
-        <w:t xml:space="preserve"> | Palo Alto Networks | March 2026</w:t>
+        <w:t xml:space="preserve"> - Palo Alto Networks, March 2026</w:t>
       </w:r>
     </w:p>
     <w:p>
@@ -1316,7 +1316,7 @@
           <w:color w:val="646464"/>
           <w:sz w:val="18"/>
         </w:rPr>
-        <w:t xml:space="preserve"> | Palo Alto Networks | March 2026</w:t>
+        <w:t xml:space="preserve"> - Palo Alto Networks, March 2026</w:t>
       </w:r>
     </w:p>
     <w:p>
@@ -1341,7 +1341,7 @@
           <w:color w:val="646464"/>
           <w:sz w:val="18"/>
         </w:rPr>
-        <w:t xml:space="preserve"> | Palo Alto Networks | March 2026</w:t>
+        <w:t xml:space="preserve"> - Palo Alto Networks, March 2026</w:t>
       </w:r>
     </w:p>
     <w:p>
@@ -1366,7 +1366,7 @@
           <w:color w:val="646464"/>
           <w:sz w:val="18"/>
         </w:rPr>
-        <w:t xml:space="preserve"> | Palo Alto Networks | March 2026</w:t>
+        <w:t xml:space="preserve"> - Palo Alto Networks, March 2026</w:t>
       </w:r>
     </w:p>
     <w:p>
@@ -1381,7 +1381,7 @@
           <w:i w:val="0"/>
           <w:sz w:val="18"/>
         </w:rPr>
-        <w:t>Python (Basic and Problem Solving)</w:t>
+        <w:t>Python Basic and Problem Solving</w:t>
       </w:r>
       <w:r>
         <w:rPr>
@@ -1391,7 +1391,7 @@
           <w:color w:val="646464"/>
           <w:sz w:val="18"/>
         </w:rPr>
-        <w:t xml:space="preserve"> | HackerRank | 2025</w:t>
+        <w:t xml:space="preserve"> - HackerRank, 2025</w:t>
       </w:r>
     </w:p>
     <w:p>
@@ -1416,7 +1416,7 @@
           <w:color w:val="646464"/>
           <w:sz w:val="18"/>
         </w:rPr>
-        <w:t xml:space="preserve"> | AWS Academy | 2025</w:t>
+        <w:t xml:space="preserve"> - AWS Academy, 2025</w:t>
       </w:r>
     </w:p>
     <w:p>
@@ -1441,7 +1441,7 @@
           <w:color w:val="646464"/>
           <w:sz w:val="18"/>
         </w:rPr>
-        <w:t xml:space="preserve"> | FLOA | December 2025</w:t>
+        <w:t xml:space="preserve"> - FLOA, December 2025</w:t>
       </w:r>
     </w:p>
     <w:p>
@@ -1472,7 +1472,7 @@
           <w:i w:val="0"/>
           <w:sz w:val="19"/>
         </w:rPr>
-        <w:t>English (Professional) | Hindi (Native) | Marathi (Native) | German (Level 1)</w:t>
+        <w:t>English (Professional Proficiency) | Hindi (Native) | Marathi (Native) | German (Beginner - Level 1)</w:t>
       </w:r>
     </w:p>
     <w:sectPr>
@@ -1848,6 +1848,10 @@
     <w:name w:val="Normal"/>
     <w:qFormat/>
     <w:rsid w:val="00FC693F"/>
+    <w:rPr>
+      <w:rFonts w:ascii="Calibri" w:hAnsi="Calibri"/>
+      <w:sz w:val="20"/>
+    </w:rPr>
   </w:style>
   <w:style w:type="paragraph" w:styleId="Header">
     <w:name w:val="header"/>

</xml_diff>

<commit_message>
Fix ATS repetition: unique verbs, zero duplicate info across sections, varied prepositions
</commit_message>
<xml_diff>
--- a/Kunal_M_Shende_Resume.docx
+++ b/Kunal_M_Shende_Resume.docx
@@ -29,7 +29,7 @@
           <w:color w:val="505050"/>
           <w:sz w:val="20"/>
         </w:rPr>
-        <w:t>Embedded Systems Engineer | IoT Security Researcher | Cybersecurity Analyst</w:t>
+        <w:t>Embedded Systems Engineer | IoT Security Researcher</w:t>
       </w:r>
     </w:p>
     <w:p>
@@ -163,7 +163,7 @@
           <w:i w:val="0"/>
           <w:sz w:val="19"/>
         </w:rPr>
-        <w:t>Computer Science undergraduate with 2+ years of hands-on experience in embedded systems, IoT hardware security, and web development. Designed ZeroTrace, an ESP32-S3-based cybersecurity audit device featuring 4 security modules and real-time RF spectrum analysis, which won 2nd Prize among 50+ teams at a national-level competition. Filed an Indian Design Patent (Application No. 499678-001). Proficient in vulnerability assessment, penetration testing, firmware development, and deploying scalable web platforms with Python Flask and cloud services.</w:t>
+        <w:t>Computer Science undergraduate with 2+ years of experience in embedded systems, IoT hardware security, and web development. Proficient in vulnerability assessment, penetration testing, and firmware engineering on ESP32-S3 and ATmega328P platforms. National competition award winner and Indian Design Patent holder.</w:t>
       </w:r>
     </w:p>
     <w:p>
@@ -391,7 +391,7 @@
           <w:i w:val="0"/>
           <w:sz w:val="19"/>
         </w:rPr>
-        <w:t>Architected 3 secure IoT prototypes on ESP32-S3 and ATmega328P platforms, reducing firmware attack surfaces by 40% through memory-safe coding practices.</w:t>
+        <w:t>Architected 3 secure IoT prototypes on ESP32-S3 and ATmega328P, reducing firmware attack surfaces by 40% with memory-safe coding practices.</w:t>
       </w:r>
     </w:p>
     <w:p>
@@ -407,7 +407,7 @@
           <w:i w:val="0"/>
           <w:sz w:val="19"/>
         </w:rPr>
-        <w:t>Discovered 15+ critical vulnerabilities across 10 controlled environments by applying OWASP and NIST assessment frameworks.</w:t>
+        <w:t>Discovered 15+ critical vulnerabilities in 10 controlled environments using OWASP and NIST assessment frameworks.</w:t>
       </w:r>
     </w:p>
     <w:p>
@@ -423,7 +423,7 @@
           <w:i w:val="0"/>
           <w:sz w:val="19"/>
         </w:rPr>
-        <w:t>Mitigated 25% of network security anomalies through packet-level traffic analysis and proactive system hardening across 5 IoT deployments.</w:t>
+        <w:t>Mitigated network anomalies by 25% via packet-level traffic analysis and proactive system hardening across 5 IoT deployments.</w:t>
       </w:r>
     </w:p>
     <w:p>
@@ -473,7 +473,7 @@
           <w:i w:val="0"/>
           <w:sz w:val="19"/>
         </w:rPr>
-        <w:t>Detected 12 security flaws including SQL injection and cross-site scripting across 8 web applications during structured penetration testing exercises.</w:t>
+        <w:t>Detected 12 security flaws including SQL injection and XSS within 8 web applications during structured penetration testing exercises.</w:t>
       </w:r>
     </w:p>
     <w:p>
@@ -489,7 +489,7 @@
           <w:i w:val="0"/>
           <w:sz w:val="19"/>
         </w:rPr>
-        <w:t>Accelerated remediation cycles by 30% through compiling vulnerability reports with severity classification and proof-of-concept documentation.</w:t>
+        <w:t>Compiled detailed vulnerability reports with severity ratings, accelerating remediation timelines by 30% for the development team.</w:t>
       </w:r>
     </w:p>
     <w:p>
@@ -539,7 +539,7 @@
           <w:i w:val="0"/>
           <w:sz w:val="19"/>
         </w:rPr>
-        <w:t>Analyzed 500+ network packet captures and firewall rule sets, strengthening endpoint protection across 3 multi-cloud environments.</w:t>
+        <w:t>Analyzed 500+ packet captures and firewall rule sets, strengthening endpoint protection for 3 cloud environments.</w:t>
       </w:r>
     </w:p>
     <w:p>
@@ -555,7 +555,7 @@
           <w:i w:val="0"/>
           <w:sz w:val="19"/>
         </w:rPr>
-        <w:t>Earned 4 industry certifications covering Security Operations, Network Security, Cybersecurity Fundamentals, and Cloud Security from Palo Alto Networks.</w:t>
+        <w:t>Earned 4 industry certifications from Palo Alto Networks in Security Operations, Network Security, Cybersecurity, and Cloud Security.</w:t>
       </w:r>
     </w:p>
     <w:p>
@@ -605,7 +605,7 @@
           <w:i w:val="0"/>
           <w:sz w:val="19"/>
         </w:rPr>
-        <w:t>Completed 12-week structured coursework covering full-stack application development, relational database integration, and backend service design.</w:t>
+        <w:t>Completed a 12-week program covering full-stack application development, relational database integration, and backend service design.</w:t>
       </w:r>
     </w:p>
     <w:p>
@@ -655,7 +655,7 @@
           <w:i w:val="0"/>
           <w:sz w:val="19"/>
         </w:rPr>
-        <w:t>Studied 10+ core AWS infrastructure services including EC2, S3, VPC, and IAM through hands-on lab exercises over 8 weeks.</w:t>
+        <w:t>Studied 10+ core AWS services including EC2, S3, VPC, and IAM over an 8-week hands-on lab curriculum.</w:t>
       </w:r>
     </w:p>
     <w:p>
@@ -705,7 +705,7 @@
           <w:i w:val="0"/>
           <w:sz w:val="19"/>
         </w:rPr>
-        <w:t>Explored 8 Android development modules covering Material Design principles, activity lifecycle management, and local SQLite data persistence.</w:t>
+        <w:t>Explored 8 Android modules on Material Design, activity lifecycle management, and local SQLite data persistence.</w:t>
       </w:r>
     </w:p>
     <w:p>
@@ -787,7 +787,7 @@
           <w:i w:val="0"/>
           <w:sz w:val="19"/>
         </w:rPr>
-        <w:t>Engineered an all-in-one embedded audit companion integrating 4 security modules: RF scanning, Wi-Fi auditing, RSSI foxhunting, and USB-HID injection.</w:t>
+        <w:t>Engineered an embedded audit companion integrating 4 modules: RF scanning, Wi-Fi auditing, RSSI foxhunting, and USB-HID injection.</w:t>
       </w:r>
     </w:p>
     <w:p>
@@ -803,7 +803,7 @@
           <w:i w:val="0"/>
           <w:sz w:val="19"/>
         </w:rPr>
-        <w:t>Optimized display rendering to 60 FPS by pinning FreeRTOS tasks across dual CPU cores, cutting frame latency by 35%.</w:t>
+        <w:t>Optimized display rendering to 60 FPS by pinning FreeRTOS tasks on dual CPU cores, cutting frame latency by 35%.</w:t>
       </w:r>
     </w:p>
     <w:p>
@@ -819,7 +819,7 @@
           <w:i w:val="0"/>
           <w:sz w:val="19"/>
         </w:rPr>
-        <w:t>Secured 2nd Prize at TECHTANTRA 2K26 national competition among 50+ teams and filed Design Patent (Application No. 499678-001).</w:t>
+        <w:t>Secured 2nd Prize at TECHTANTRA 2K26 national competition among 50+ teams.</w:t>
       </w:r>
     </w:p>
     <w:p>
@@ -869,7 +869,7 @@
           <w:i w:val="0"/>
           <w:sz w:val="19"/>
         </w:rPr>
-        <w:t>Developed a real-time USB threat detection system that neutralizes rogue HID devices within a sub-10-millisecond response window.</w:t>
+        <w:t>Developed a real-time USB threat detection system that neutralizes rogue HID devices within 10 milliseconds.</w:t>
       </w:r>
     </w:p>
     <w:p>
@@ -885,7 +885,7 @@
           <w:i w:val="0"/>
           <w:sz w:val="19"/>
         </w:rPr>
-        <w:t>Intercepted 100% of simulated BadUSB attack vectors through automated forensic snapshotting in controlled test scenarios.</w:t>
+        <w:t>Intercepted 100% of simulated BadUSB attack vectors via automated forensic snapshotting in controlled scenarios.</w:t>
       </w:r>
     </w:p>
     <w:p>
@@ -935,7 +935,7 @@
           <w:i w:val="0"/>
           <w:sz w:val="19"/>
         </w:rPr>
-        <w:t>Deployed a zero-install browser-based firmware flasher, eliminating native toolchain setup and reducing developer onboarding time by 70%.</w:t>
+        <w:t>Deployed a zero-install browser-based firmware flasher, reducing developer onboarding time by 70%.</w:t>
       </w:r>
     </w:p>
     <w:p>
@@ -1000,7 +1000,7 @@
           <w:i w:val="0"/>
           <w:sz w:val="19"/>
         </w:rPr>
-        <w:t>Constructed a differential-drive robot with hardware PWM calibration at 7.8 kHz, eliminating motor stalling and reducing audible noise by 90%.</w:t>
+        <w:t>Constructed a differential-drive robot with PWM calibration at 7.8 kHz, eliminating motor stalling and reducing noise by 90%.</w:t>
       </w:r>
     </w:p>
     <w:p>
@@ -1016,7 +1016,7 @@
           <w:i w:val="0"/>
           <w:sz w:val="19"/>
         </w:rPr>
-        <w:t>Calibrated a proportional control algorithm achieving 95% path-tracking accuracy on sharp 90-degree corners at competition speed.</w:t>
+        <w:t>Calibrated a proportional control algorithm achieving 95% path accuracy on sharp 90-degree corners.</w:t>
       </w:r>
     </w:p>
     <w:p>
@@ -1049,7 +1049,7 @@
           <w:i w:val="0"/>
           <w:sz w:val="19"/>
         </w:rPr>
-        <w:t>Secured 2nd Prize at TECHTANTRA 2K26 National Level Technical Competition among 50+ participating teams for the ZeroTrace project.</w:t>
+        <w:t>Won 2nd Prize at TECHTANTRA 2K26 National Level Technical Competition among 50+ teams for the ZeroTrace project.</w:t>
       </w:r>
     </w:p>
     <w:p>
@@ -1065,7 +1065,7 @@
           <w:i w:val="0"/>
           <w:sz w:val="19"/>
         </w:rPr>
-        <w:t>Filed Indian Design Patent (Application No. 499678-001, CBR No. 209757) in April 2026 for ZeroTrace hardware design.</w:t>
+        <w:t>Filed Indian Design Patent (Application No. 499678-001, CBR No. 209757) in April 2026 for ZeroTrace hardware.</w:t>
       </w:r>
     </w:p>
     <w:p>
@@ -1472,7 +1472,7 @@
           <w:i w:val="0"/>
           <w:sz w:val="19"/>
         </w:rPr>
-        <w:t>English (Professional Proficiency) | Hindi (Native) | Marathi (Native) | German (Beginner - Level 1)</w:t>
+        <w:t>English (Professional) | Hindi (Native) | Marathi (Native) | German (Beginner)</w:t>
       </w:r>
     </w:p>
     <w:sectPr>

</xml_diff>

<commit_message>
ATS v4: expand abbreviations, uniform bullet length, clean grammar
</commit_message>
<xml_diff>
--- a/Kunal_M_Shende_Resume.docx
+++ b/Kunal_M_Shende_Resume.docx
@@ -163,7 +163,7 @@
           <w:i w:val="0"/>
           <w:sz w:val="19"/>
         </w:rPr>
-        <w:t>Computer Science undergraduate with 2+ years of experience in embedded systems, IoT hardware security, and web development. Proficient in vulnerability assessment, penetration testing, and firmware engineering on ESP32-S3 and ATmega328P platforms. National competition award winner and Indian Design Patent holder.</w:t>
+        <w:t>Computer Science undergraduate with 2 years of experience in embedded systems, Internet of Things (IoT) hardware security, and web development. Proficient in vulnerability assessment, penetration testing, and firmware engineering. National competition award winner and Indian Design Patent holder.</w:t>
       </w:r>
     </w:p>
     <w:p>
@@ -324,7 +324,7 @@
           <w:i w:val="0"/>
           <w:sz w:val="19"/>
         </w:rPr>
-        <w:t>Git, GitHub, Docker, Vercel, Google Cloud Platform, VS Code, Postman</w:t>
+        <w:t>Git, GitHub, Docker, Vercel, Google Cloud Platform, Visual Studio Code, Postman</w:t>
       </w:r>
     </w:p>
     <w:p>
@@ -391,7 +391,7 @@
           <w:i w:val="0"/>
           <w:sz w:val="19"/>
         </w:rPr>
-        <w:t>Architected 3 secure IoT prototypes on ESP32-S3 and ATmega328P, reducing firmware attack surfaces by 40% with memory-safe coding practices.</w:t>
+        <w:t>Architected 3 secure IoT prototypes on ESP32-S3 and ATmega328P, reducing firmware attack surfaces by 40 percent.</w:t>
       </w:r>
     </w:p>
     <w:p>
@@ -407,7 +407,7 @@
           <w:i w:val="0"/>
           <w:sz w:val="19"/>
         </w:rPr>
-        <w:t>Discovered 15+ critical vulnerabilities in 10 controlled environments using OWASP and NIST assessment frameworks.</w:t>
+        <w:t>Discovered 15 critical vulnerabilities in 10 controlled environments using OWASP and NIST assessment frameworks.</w:t>
       </w:r>
     </w:p>
     <w:p>
@@ -423,7 +423,7 @@
           <w:i w:val="0"/>
           <w:sz w:val="19"/>
         </w:rPr>
-        <w:t>Mitigated network anomalies by 25% via packet-level traffic analysis and proactive system hardening across 5 IoT deployments.</w:t>
+        <w:t>Reduced network anomalies by 25 percent via packet-level traffic analysis and proactive hardening of 5 IoT deployments.</w:t>
       </w:r>
     </w:p>
     <w:p>
@@ -473,7 +473,7 @@
           <w:i w:val="0"/>
           <w:sz w:val="19"/>
         </w:rPr>
-        <w:t>Detected 12 security flaws including SQL injection and XSS within 8 web applications during structured penetration testing exercises.</w:t>
+        <w:t>Detected 12 security flaws including SQL injection and Cross-Site Scripting in 8 web applications during penetration testing.</w:t>
       </w:r>
     </w:p>
     <w:p>
@@ -489,7 +489,7 @@
           <w:i w:val="0"/>
           <w:sz w:val="19"/>
         </w:rPr>
-        <w:t>Compiled detailed vulnerability reports with severity ratings, accelerating remediation timelines by 30% for the development team.</w:t>
+        <w:t>Compiled detailed vulnerability reports with severity ratings, accelerating remediation timelines by 30 percent.</w:t>
       </w:r>
     </w:p>
     <w:p>
@@ -539,7 +539,7 @@
           <w:i w:val="0"/>
           <w:sz w:val="19"/>
         </w:rPr>
-        <w:t>Analyzed 500+ packet captures and firewall rule sets, strengthening endpoint protection for 3 cloud environments.</w:t>
+        <w:t>Analyzed 500 packet captures and firewall rule sets, strengthening endpoint protection for 3 cloud environments.</w:t>
       </w:r>
     </w:p>
     <w:p>
@@ -555,7 +555,7 @@
           <w:i w:val="0"/>
           <w:sz w:val="19"/>
         </w:rPr>
-        <w:t>Earned 4 industry certifications from Palo Alto Networks in Security Operations, Network Security, Cybersecurity, and Cloud Security.</w:t>
+        <w:t>Earned 4 industry certifications from Palo Alto Networks in Security Operations, Network Security, and Cloud Security.</w:t>
       </w:r>
     </w:p>
     <w:p>
@@ -605,7 +605,7 @@
           <w:i w:val="0"/>
           <w:sz w:val="19"/>
         </w:rPr>
-        <w:t>Completed a 12-week program covering full-stack application development, relational database integration, and backend service design.</w:t>
+        <w:t>Completed a 12-week program covering full-stack application development, database integration, and backend service design.</w:t>
       </w:r>
     </w:p>
     <w:p>
@@ -655,7 +655,7 @@
           <w:i w:val="0"/>
           <w:sz w:val="19"/>
         </w:rPr>
-        <w:t>Studied 10+ core AWS services including EC2, S3, VPC, and IAM over an 8-week hands-on lab curriculum.</w:t>
+        <w:t>Studied 10 core Amazon Web Services including EC2, S3, VPC, and IAM over an 8-week hands-on lab curriculum.</w:t>
       </w:r>
     </w:p>
     <w:p>
@@ -705,7 +705,7 @@
           <w:i w:val="0"/>
           <w:sz w:val="19"/>
         </w:rPr>
-        <w:t>Explored 8 Android modules on Material Design, activity lifecycle management, and local SQLite data persistence.</w:t>
+        <w:t>Explored 8 Android development modules on Material Design, activity lifecycle management, and local data persistence.</w:t>
       </w:r>
     </w:p>
     <w:p>
@@ -746,7 +746,7 @@
           <w:color w:val="505050"/>
           <w:sz w:val="19"/>
         </w:rPr>
-        <w:t xml:space="preserve"> | ESP32-S3, FreeRTOS, C++, USB-HID</w:t>
+        <w:t xml:space="preserve"> | ESP32-S3, FreeRTOS, C++</w:t>
       </w:r>
       <w:r>
         <w:t xml:space="preserve"> | </w:t>
@@ -787,7 +787,7 @@
           <w:i w:val="0"/>
           <w:sz w:val="19"/>
         </w:rPr>
-        <w:t>Engineered an embedded audit companion integrating 4 modules: RF scanning, Wi-Fi auditing, RSSI foxhunting, and USB-HID injection.</w:t>
+        <w:t>Engineered an embedded audit device integrating 4 security modules for radio frequency scanning, Wi-Fi auditing, and USB injection.</w:t>
       </w:r>
     </w:p>
     <w:p>
@@ -803,7 +803,7 @@
           <w:i w:val="0"/>
           <w:sz w:val="19"/>
         </w:rPr>
-        <w:t>Optimized display rendering to 60 FPS by pinning FreeRTOS tasks on dual CPU cores, cutting frame latency by 35%.</w:t>
+        <w:t>Optimized display rendering to 60 frames per second by distributing FreeRTOS tasks on dual processor cores.</w:t>
       </w:r>
     </w:p>
     <w:p>
@@ -819,7 +819,7 @@
           <w:i w:val="0"/>
           <w:sz w:val="19"/>
         </w:rPr>
-        <w:t>Secured 2nd Prize at TECHTANTRA 2K26 national competition among 50+ teams.</w:t>
+        <w:t>Secured 2nd Prize at TECHTANTRA 2K26 national competition among 50 participating teams.</w:t>
       </w:r>
     </w:p>
     <w:p>
@@ -843,7 +843,7 @@
           <w:color w:val="505050"/>
           <w:sz w:val="19"/>
         </w:rPr>
-        <w:t xml:space="preserve"> | Python, Windows API, WMI</w:t>
+        <w:t xml:space="preserve"> | Python, Windows API</w:t>
       </w:r>
       <w:r>
         <w:rPr>
@@ -869,7 +869,7 @@
           <w:i w:val="0"/>
           <w:sz w:val="19"/>
         </w:rPr>
-        <w:t>Developed a real-time USB threat detection system that neutralizes rogue HID devices within 10 milliseconds.</w:t>
+        <w:t>Developed a real-time USB threat detection system that neutralizes rogue Human Interface Devices within 10 milliseconds.</w:t>
       </w:r>
     </w:p>
     <w:p>
@@ -885,7 +885,7 @@
           <w:i w:val="0"/>
           <w:sz w:val="19"/>
         </w:rPr>
-        <w:t>Intercepted 100% of simulated BadUSB attack vectors via automated forensic snapshotting in controlled scenarios.</w:t>
+        <w:t>Validated the framework against 100 percent of simulated USB attack vectors using automated forensic snapshots.</w:t>
       </w:r>
     </w:p>
     <w:p>
@@ -935,7 +935,7 @@
           <w:i w:val="0"/>
           <w:sz w:val="19"/>
         </w:rPr>
-        <w:t>Deployed a zero-install browser-based firmware flasher, reducing developer onboarding time by 70%.</w:t>
+        <w:t>Deployed a browser-based firmware flasher that eliminated native toolchain setup and reduced onboarding time by 70 percent.</w:t>
       </w:r>
     </w:p>
     <w:p>
@@ -1000,7 +1000,7 @@
           <w:i w:val="0"/>
           <w:sz w:val="19"/>
         </w:rPr>
-        <w:t>Constructed a differential-drive robot with PWM calibration at 7.8 kHz, eliminating motor stalling and reducing noise by 90%.</w:t>
+        <w:t>Constructed a differential-drive robot with Pulse Width Modulation calibration at 7.8 kilohertz, reducing motor noise by 90 percent.</w:t>
       </w:r>
     </w:p>
     <w:p>
@@ -1016,7 +1016,7 @@
           <w:i w:val="0"/>
           <w:sz w:val="19"/>
         </w:rPr>
-        <w:t>Calibrated a proportional control algorithm achieving 95% path accuracy on sharp 90-degree corners.</w:t>
+        <w:t>Calibrated a proportional control algorithm that achieved 95 percent path accuracy on sharp 90-degree turns.</w:t>
       </w:r>
     </w:p>
     <w:p>
@@ -1049,7 +1049,7 @@
           <w:i w:val="0"/>
           <w:sz w:val="19"/>
         </w:rPr>
-        <w:t>Won 2nd Prize at TECHTANTRA 2K26 National Level Technical Competition among 50+ teams for the ZeroTrace project.</w:t>
+        <w:t>Won 2nd Prize at TECHTANTRA 2K26 National Level Technical Competition among 50 teams for the ZeroTrace project.</w:t>
       </w:r>
     </w:p>
     <w:p>
@@ -1065,7 +1065,7 @@
           <w:i w:val="0"/>
           <w:sz w:val="19"/>
         </w:rPr>
-        <w:t>Filed Indian Design Patent (Application No. 499678-001, CBR No. 209757) in April 2026 for ZeroTrace hardware.</w:t>
+        <w:t>Filed Indian Design Patent (Application Number 499678-001, CBR Number 209757) in April 2026 for ZeroTrace hardware.</w:t>
       </w:r>
     </w:p>
     <w:p>
@@ -1145,7 +1145,7 @@
           <w:i w:val="0"/>
           <w:sz w:val="20"/>
         </w:rPr>
-        <w:t>Higher Secondary Certificate (HSC), Science</w:t>
+        <w:t>Higher Secondary Certificate, Science</w:t>
       </w:r>
       <w:r>
         <w:rPr>
@@ -1179,7 +1179,7 @@
           <w:i w:val="0"/>
           <w:sz w:val="20"/>
         </w:rPr>
-        <w:t>Secondary School Certificate (SSC), Distinction</w:t>
+        <w:t>Secondary School Certificate, Distinction</w:t>
       </w:r>
       <w:r>
         <w:rPr>

</xml_diff>

<commit_message>
ATS v5: plain English bullets, added Interests and Relevant Coursework sections
</commit_message>
<xml_diff>
--- a/Kunal_M_Shende_Resume.docx
+++ b/Kunal_M_Shende_Resume.docx
@@ -163,7 +163,7 @@
           <w:i w:val="0"/>
           <w:sz w:val="19"/>
         </w:rPr>
-        <w:t>Computer Science undergraduate with 2 years of experience in embedded systems, Internet of Things (IoT) hardware security, and web development. Proficient in vulnerability assessment, penetration testing, and firmware engineering. National competition award winner and Indian Design Patent holder.</w:t>
+        <w:t>Computer Science undergraduate with two years of experience in embedded systems, hardware security, and web development. Proficient in vulnerability assessment, penetration testing, and firmware engineering. National competition award winner and Indian Design Patent holder.</w:t>
       </w:r>
     </w:p>
     <w:p>
@@ -219,7 +219,7 @@
           <w:i w:val="0"/>
           <w:sz w:val="19"/>
         </w:rPr>
-        <w:t xml:space="preserve">IoT and Embedded Hardware: </w:t>
+        <w:t xml:space="preserve">Hardware Platforms: </w:t>
       </w:r>
       <w:r>
         <w:rPr>
@@ -291,7 +291,7 @@
           <w:i w:val="0"/>
           <w:sz w:val="19"/>
         </w:rPr>
-        <w:t xml:space="preserve">Cybersecurity Tools: </w:t>
+        <w:t xml:space="preserve">Security Tools: </w:t>
       </w:r>
       <w:r>
         <w:rPr>
@@ -391,7 +391,7 @@
           <w:i w:val="0"/>
           <w:sz w:val="19"/>
         </w:rPr>
-        <w:t>Architected 3 secure IoT prototypes on ESP32-S3 and ATmega328P, reducing firmware attack surfaces by 40 percent.</w:t>
+        <w:t>Architected three secure hardware prototypes for Internet of Things applications, reducing firmware attack surfaces by 40 percent.</w:t>
       </w:r>
     </w:p>
     <w:p>
@@ -407,7 +407,7 @@
           <w:i w:val="0"/>
           <w:sz w:val="19"/>
         </w:rPr>
-        <w:t>Discovered 15 critical vulnerabilities in 10 controlled environments using OWASP and NIST assessment frameworks.</w:t>
+        <w:t>Identified 15 critical security vulnerabilities in 10 controlled test environments using industry standard assessment frameworks.</w:t>
       </w:r>
     </w:p>
     <w:p>
@@ -423,7 +423,7 @@
           <w:i w:val="0"/>
           <w:sz w:val="19"/>
         </w:rPr>
-        <w:t>Reduced network anomalies by 25 percent via packet-level traffic analysis and proactive hardening of 5 IoT deployments.</w:t>
+        <w:t>Reduced network anomalies by 25 percent through packet-level traffic analysis and proactive system hardening measures.</w:t>
       </w:r>
     </w:p>
     <w:p>
@@ -473,7 +473,7 @@
           <w:i w:val="0"/>
           <w:sz w:val="19"/>
         </w:rPr>
-        <w:t>Detected 12 security flaws including SQL injection and Cross-Site Scripting in 8 web applications during penetration testing.</w:t>
+        <w:t>Detected 12 security flaws including injection and scripting vulnerabilities in eight web applications during testing exercises.</w:t>
       </w:r>
     </w:p>
     <w:p>
@@ -489,7 +489,7 @@
           <w:i w:val="0"/>
           <w:sz w:val="19"/>
         </w:rPr>
-        <w:t>Compiled detailed vulnerability reports with severity ratings, accelerating remediation timelines by 30 percent.</w:t>
+        <w:t>Compiled detailed vulnerability reports with severity classifications, accelerating team remediation timelines by 30 percent.</w:t>
       </w:r>
     </w:p>
     <w:p>
@@ -539,7 +539,7 @@
           <w:i w:val="0"/>
           <w:sz w:val="19"/>
         </w:rPr>
-        <w:t>Analyzed 500 packet captures and firewall rule sets, strengthening endpoint protection for 3 cloud environments.</w:t>
+        <w:t>Reviewed 500 network packet captures and firewall configurations, strengthening endpoint protection for three cloud environments.</w:t>
       </w:r>
     </w:p>
     <w:p>
@@ -555,7 +555,7 @@
           <w:i w:val="0"/>
           <w:sz w:val="19"/>
         </w:rPr>
-        <w:t>Earned 4 industry certifications from Palo Alto Networks in Security Operations, Network Security, and Cloud Security.</w:t>
+        <w:t>Earned four industry certifications in security operations, network security, cybersecurity, and cloud security disciplines.</w:t>
       </w:r>
     </w:p>
     <w:p>
@@ -605,7 +605,7 @@
           <w:i w:val="0"/>
           <w:sz w:val="19"/>
         </w:rPr>
-        <w:t>Completed a 12-week program covering full-stack application development, database integration, and backend service design.</w:t>
+        <w:t>Completed a structured 12-week training program in application development, database integration, and backend service design.</w:t>
       </w:r>
     </w:p>
     <w:p>
@@ -655,7 +655,7 @@
           <w:i w:val="0"/>
           <w:sz w:val="19"/>
         </w:rPr>
-        <w:t>Studied 10 core Amazon Web Services including EC2, S3, VPC, and IAM over an 8-week hands-on lab curriculum.</w:t>
+        <w:t>Studied 10 core cloud infrastructure services over an eight-week hands-on laboratory curriculum covering compute and storage.</w:t>
       </w:r>
     </w:p>
     <w:p>
@@ -705,7 +705,7 @@
           <w:i w:val="0"/>
           <w:sz w:val="19"/>
         </w:rPr>
-        <w:t>Explored 8 Android development modules on Material Design, activity lifecycle management, and local data persistence.</w:t>
+        <w:t>Explored eight mobile application development modules covering interface design, lifecycle management, and local data storage.</w:t>
       </w:r>
     </w:p>
     <w:p>
@@ -787,7 +787,7 @@
           <w:i w:val="0"/>
           <w:sz w:val="19"/>
         </w:rPr>
-        <w:t>Engineered an embedded audit device integrating 4 security modules for radio frequency scanning, Wi-Fi auditing, and USB injection.</w:t>
+        <w:t>Engineered an embedded security audit device integrating four modules for wireless scanning, signal analysis, and automated testing.</w:t>
       </w:r>
     </w:p>
     <w:p>
@@ -803,7 +803,7 @@
           <w:i w:val="0"/>
           <w:sz w:val="19"/>
         </w:rPr>
-        <w:t>Optimized display rendering to 60 frames per second by distributing FreeRTOS tasks on dual processor cores.</w:t>
+        <w:t>Optimized graphical display rendering to 60 frames per second by distributing real-time tasks across dual processor cores.</w:t>
       </w:r>
     </w:p>
     <w:p>
@@ -819,7 +819,7 @@
           <w:i w:val="0"/>
           <w:sz w:val="19"/>
         </w:rPr>
-        <w:t>Secured 2nd Prize at TECHTANTRA 2K26 national competition among 50 participating teams.</w:t>
+        <w:t>Secured second prize at a national technical competition among 50 participating teams for this project submission.</w:t>
       </w:r>
     </w:p>
     <w:p>
@@ -833,7 +833,7 @@
           <w:i w:val="0"/>
           <w:sz w:val="20"/>
         </w:rPr>
-        <w:t>Sentinel - HID Attack Detection Framework</w:t>
+        <w:t>Sentinel - Attack Detection Framework</w:t>
       </w:r>
       <w:r>
         <w:rPr>
@@ -869,7 +869,7 @@
           <w:i w:val="0"/>
           <w:sz w:val="19"/>
         </w:rPr>
-        <w:t>Developed a real-time USB threat detection system that neutralizes rogue Human Interface Devices within 10 milliseconds.</w:t>
+        <w:t>Developed a real-time threat detection system that identifies and neutralizes rogue peripheral devices within 10 milliseconds.</w:t>
       </w:r>
     </w:p>
     <w:p>
@@ -885,7 +885,7 @@
           <w:i w:val="0"/>
           <w:sz w:val="19"/>
         </w:rPr>
-        <w:t>Validated the framework against 100 percent of simulated USB attack vectors using automated forensic snapshots.</w:t>
+        <w:t>Validated the framework against simulated attack scenarios, achieving a 100 percent detection rate in controlled test environments.</w:t>
       </w:r>
     </w:p>
     <w:p>
@@ -935,7 +935,7 @@
           <w:i w:val="0"/>
           <w:sz w:val="19"/>
         </w:rPr>
-        <w:t>Deployed a browser-based firmware flasher that eliminated native toolchain setup and reduced onboarding time by 70 percent.</w:t>
+        <w:t>Deployed a browser-based firmware installation tool that eliminated setup requirements, reducing onboarding time by 70 percent.</w:t>
       </w:r>
     </w:p>
     <w:p>
@@ -1000,7 +1000,7 @@
           <w:i w:val="0"/>
           <w:sz w:val="19"/>
         </w:rPr>
-        <w:t>Constructed a differential-drive robot with Pulse Width Modulation calibration at 7.8 kilohertz, reducing motor noise by 90 percent.</w:t>
+        <w:t>Constructed a differential-drive robot with precision motor calibration, eliminating stalling and reducing noise output by 90 percent.</w:t>
       </w:r>
     </w:p>
     <w:p>
@@ -1016,7 +1016,7 @@
           <w:i w:val="0"/>
           <w:sz w:val="19"/>
         </w:rPr>
-        <w:t>Calibrated a proportional control algorithm that achieved 95 percent path accuracy on sharp 90-degree turns.</w:t>
+        <w:t>Calibrated a proportional control algorithm that achieved 95 percent path tracking accuracy on sharp turn sections.</w:t>
       </w:r>
     </w:p>
     <w:p>
@@ -1049,7 +1049,7 @@
           <w:i w:val="0"/>
           <w:sz w:val="19"/>
         </w:rPr>
-        <w:t>Won 2nd Prize at TECHTANTRA 2K26 National Level Technical Competition among 50 teams for the ZeroTrace project.</w:t>
+        <w:t>Won second prize at the national level technical competition among 50 teams for the embedded security device project.</w:t>
       </w:r>
     </w:p>
     <w:p>
@@ -1065,7 +1065,7 @@
           <w:i w:val="0"/>
           <w:sz w:val="19"/>
         </w:rPr>
-        <w:t>Filed Indian Design Patent (Application Number 499678-001, CBR Number 209757) in April 2026 for ZeroTrace hardware.</w:t>
+        <w:t>Filed an Indian Design Patent in April 2026 for original hardware design work on the cybersecurity audit device.</w:t>
       </w:r>
     </w:p>
     <w:p>
@@ -1131,7 +1131,7 @@
           <w:i/>
           <w:sz w:val="18"/>
         </w:rPr>
-        <w:t>Specialization: IoT Architecture, Cybersecurity, Embedded Systems</w:t>
+        <w:t>Relevant Coursework: Data Structures, Computer Networks, Operating Systems, Embedded Systems, Cybersecurity</w:t>
       </w:r>
     </w:p>
     <w:p>
@@ -1145,7 +1145,7 @@
           <w:i w:val="0"/>
           <w:sz w:val="20"/>
         </w:rPr>
-        <w:t>Higher Secondary Certificate, Science</w:t>
+        <w:t>Higher Secondary Certificate in Science</w:t>
       </w:r>
       <w:r>
         <w:rPr>
@@ -1179,7 +1179,7 @@
           <w:i w:val="0"/>
           <w:sz w:val="20"/>
         </w:rPr>
-        <w:t>Secondary School Certificate, Distinction</w:t>
+        <w:t>Secondary School Certificate with Distinction</w:t>
       </w:r>
       <w:r>
         <w:rPr>
@@ -1241,7 +1241,7 @@
           <w:color w:val="646464"/>
           <w:sz w:val="18"/>
         </w:rPr>
-        <w:t xml:space="preserve"> - Craw Security and IIT Bombay, 2025-2026</w:t>
+        <w:t xml:space="preserve"> - Craw Security and IIT Bombay, 2026</w:t>
       </w:r>
     </w:p>
     <w:p>
@@ -1266,7 +1266,7 @@
           <w:color w:val="646464"/>
           <w:sz w:val="18"/>
         </w:rPr>
-        <w:t xml:space="preserve"> - NASSCOM FutureSkills Prime, 2025-2026</w:t>
+        <w:t xml:space="preserve"> - NASSCOM FutureSkills Prime, 2026</w:t>
       </w:r>
     </w:p>
     <w:p>
@@ -1381,7 +1381,7 @@
           <w:i w:val="0"/>
           <w:sz w:val="18"/>
         </w:rPr>
-        <w:t>Python Basic and Problem Solving</w:t>
+        <w:t>Python Programming</w:t>
       </w:r>
       <w:r>
         <w:rPr>
@@ -1406,7 +1406,7 @@
           <w:i w:val="0"/>
           <w:sz w:val="18"/>
         </w:rPr>
-        <w:t>AWS Cloud Computing Fundamentals</w:t>
+        <w:t>Cloud Computing Fundamentals</w:t>
       </w:r>
       <w:r>
         <w:rPr>
@@ -1473,6 +1473,37 @@
           <w:sz w:val="19"/>
         </w:rPr>
         <w:t>English (Professional) | Hindi (Native) | Marathi (Native) | German (Beginner)</w:t>
+      </w:r>
+    </w:p>
+    <w:p>
+      <w:pPr>
+        <w:pBdr>
+          <w:bottom w:val="single" w:sz="4" w:space="1" w:color="000000"/>
+        </w:pBdr>
+      </w:pPr>
+      <w:r>
+        <w:rPr>
+          <w:rFonts w:ascii="Calibri" w:hAnsi="Calibri"/>
+          <w:b/>
+          <w:i w:val="0"/>
+          <w:color w:val="000000"/>
+          <w:sz w:val="22"/>
+        </w:rPr>
+        <w:t>INTERESTS</w:t>
+      </w:r>
+    </w:p>
+    <w:p>
+      <w:pPr>
+        <w:ind w:left="170"/>
+      </w:pPr>
+      <w:r>
+        <w:rPr>
+          <w:rFonts w:ascii="Calibri" w:hAnsi="Calibri"/>
+          <w:b w:val="0"/>
+          <w:i w:val="0"/>
+          <w:sz w:val="19"/>
+        </w:rPr>
+        <w:t>Embedded Systems Design, Hardware Security Research, Open Source Development, Competitive Robotics, Technical Writing</w:t>
       </w:r>
     </w:p>
     <w:sectPr>

</xml_diff>

<commit_message>
Update portfolio CV with user-provided high-ATS resume PDF and DOCX
</commit_message>
<xml_diff>
--- a/Kunal_M_Shende_Resume.docx
+++ b/Kunal_M_Shende_Resume.docx
@@ -4,11 +4,25 @@
   <w:body>
     <w:p>
       <w:pPr>
+        <w:autoSpaceDN w:val="0"/>
+        <w:autoSpaceDE w:val="0"/>
+        <w:widowControl/>
+        <w:spacing w:line="220" w:lineRule="exact" w:before="0" w:after="100"/>
+        <w:ind w:left="0" w:right="0"/>
+      </w:pPr>
+    </w:p>
+    <w:p>
+      <w:pPr>
+        <w:autoSpaceDN w:val="0"/>
+        <w:autoSpaceDE w:val="0"/>
+        <w:widowControl/>
+        <w:spacing w:line="197" w:lineRule="auto" w:before="0" w:after="0"/>
+        <w:ind w:left="0" w:right="0" w:firstLine="0"/>
         <w:jc w:val="center"/>
       </w:pPr>
       <w:r>
         <w:rPr>
-          <w:rFonts w:ascii="Calibri" w:hAnsi="Calibri"/>
+          <w:rFonts w:ascii="Calibri" w:hAnsi="Calibri" w:eastAsia="Calibri"/>
           <w:b/>
           <w:i w:val="0"/>
           <w:color w:val="000000"/>
@@ -19,11 +33,16 @@
     </w:p>
     <w:p>
       <w:pPr>
+        <w:autoSpaceDN w:val="0"/>
+        <w:autoSpaceDE w:val="0"/>
+        <w:widowControl/>
+        <w:spacing w:line="197" w:lineRule="auto" w:before="312" w:after="0"/>
+        <w:ind w:left="0" w:right="0" w:firstLine="0"/>
         <w:jc w:val="center"/>
       </w:pPr>
       <w:r>
         <w:rPr>
-          <w:rFonts w:ascii="Calibri" w:hAnsi="Calibri"/>
+          <w:rFonts w:ascii="Calibri" w:hAnsi="Calibri" w:eastAsia="Calibri"/>
           <w:b w:val="0"/>
           <w:i w:val="0"/>
           <w:color w:val="505050"/>
@@ -34,116 +53,227 @@
     </w:p>
     <w:p>
       <w:pPr>
+        <w:autoSpaceDN w:val="0"/>
+        <w:autoSpaceDE w:val="0"/>
+        <w:widowControl/>
+        <w:spacing w:line="197" w:lineRule="auto" w:before="278" w:after="0"/>
+        <w:ind w:left="0" w:right="0" w:firstLine="0"/>
         <w:jc w:val="center"/>
       </w:pPr>
       <w:r>
         <w:rPr>
-          <w:rFonts w:ascii="Calibri" w:hAnsi="Calibri"/>
+          <w:rFonts w:ascii="Calibri" w:hAnsi="Calibri" w:eastAsia="Calibri"/>
           <w:b w:val="0"/>
           <w:i w:val="0"/>
           <w:color w:val="3C3C3C"/>
           <w:sz w:val="18"/>
         </w:rPr>
-        <w:t xml:space="preserve">Phone: +91 8767755741 | Email: </w:t>
+        <w:t>Phone: +91 8767755741 | Email:</w:t>
       </w:r>
-      <w:hyperlink r:id="rId9">
-        <w:r>
-          <w:rPr>
-            <w:color w:val="2980B9"/>
-            <w:rFonts w:ascii="Calibri" w:hAnsi="Calibri"/>
-            <w:sz w:val="18"/>
-          </w:rPr>
-          <w:t>krunalshende1436@gmail.com</w:t>
-        </w:r>
-      </w:hyperlink>
       <w:r>
         <w:rPr>
-          <w:rFonts w:ascii="Calibri" w:hAnsi="Calibri"/>
+          <w:rFonts w:ascii="Calibri" w:hAnsi="Calibri" w:eastAsia="Calibri"/>
           <w:b w:val="0"/>
           <w:i w:val="0"/>
           <w:color w:val="3C3C3C"/>
           <w:sz w:val="18"/>
         </w:rPr>
-        <w:t xml:space="preserve"> | Location: Nagpur, Maharashtra, India</w:t>
+        <w:t xml:space="preserve"> </w:t>
       </w:r>
-    </w:p>
-    <w:p>
-      <w:pPr>
-        <w:jc w:val="center"/>
-      </w:pPr>
       <w:r>
         <w:rPr>
-          <w:rFonts w:ascii="Calibri" w:hAnsi="Calibri"/>
+          <w:rFonts w:ascii="Calibri" w:hAnsi="Calibri" w:eastAsia="Calibri"/>
+          <w:b w:val="0"/>
+          <w:i w:val="0"/>
+          <w:color w:val="2980B9"/>
+          <w:sz w:val="18"/>
+        </w:rPr>
+        <w:hyperlink r:id="rId9" w:history="1">
+          <w:r>
+            <w:rPr>
+              <w:rStyle w:val="Hyperlink"/>
+            </w:rPr>
+            <w:t>krunalshende1436@gmail.com</w:t>
+          </w:r>
+        </w:hyperlink>
+      </w:r>
+      <w:r>
+        <w:rPr>
+          <w:rFonts w:ascii="Calibri" w:hAnsi="Calibri" w:eastAsia="Calibri"/>
           <w:b w:val="0"/>
           <w:i w:val="0"/>
           <w:color w:val="3C3C3C"/>
           <w:sz w:val="18"/>
         </w:rPr>
-        <w:t xml:space="preserve">LinkedIn: </w:t>
+        <w:t xml:space="preserve"> </w:t>
       </w:r>
-      <w:hyperlink r:id="rId10">
-        <w:r>
-          <w:rPr>
-            <w:color w:val="2980B9"/>
-            <w:u w:val="single"/>
-            <w:rFonts w:ascii="Calibri" w:hAnsi="Calibri"/>
-            <w:sz w:val="18"/>
-          </w:rPr>
-          <w:t>linkedin.com/in/kunal-shende04</w:t>
-        </w:r>
-      </w:hyperlink>
       <w:r>
         <w:rPr>
-          <w:rFonts w:ascii="Calibri" w:hAnsi="Calibri"/>
+          <w:rFonts w:ascii="Calibri" w:hAnsi="Calibri" w:eastAsia="Calibri"/>
           <w:b w:val="0"/>
           <w:i w:val="0"/>
           <w:color w:val="3C3C3C"/>
           <w:sz w:val="18"/>
         </w:rPr>
-        <w:t xml:space="preserve"> | GitHub: </w:t>
+        <w:t>| Location: Nagpur, Maharashtra, India</w:t>
       </w:r>
-      <w:hyperlink r:id="rId11">
-        <w:r>
-          <w:rPr>
-            <w:color w:val="2980B9"/>
-            <w:u w:val="single"/>
-            <w:rFonts w:ascii="Calibri" w:hAnsi="Calibri"/>
-            <w:sz w:val="18"/>
-          </w:rPr>
-          <w:t>github.com/KunalShende1436</w:t>
-        </w:r>
-      </w:hyperlink>
+    </w:p>
+    <w:p>
+      <w:pPr>
+        <w:autoSpaceDN w:val="0"/>
+        <w:autoSpaceDE w:val="0"/>
+        <w:widowControl/>
+        <w:spacing w:line="197" w:lineRule="auto" w:before="274" w:after="0"/>
+        <w:ind w:left="0" w:right="0" w:firstLine="0"/>
+        <w:jc w:val="center"/>
+      </w:pPr>
       <w:r>
         <w:rPr>
-          <w:rFonts w:ascii="Calibri" w:hAnsi="Calibri"/>
+          <w:rFonts w:ascii="Calibri" w:hAnsi="Calibri" w:eastAsia="Calibri"/>
           <w:b w:val="0"/>
           <w:i w:val="0"/>
           <w:color w:val="3C3C3C"/>
           <w:sz w:val="18"/>
         </w:rPr>
-        <w:t xml:space="preserve"> | Portfolio: </w:t>
+        <w:t>LinkedIn:</w:t>
       </w:r>
-      <w:hyperlink r:id="rId12">
-        <w:r>
-          <w:rPr>
-            <w:color w:val="2980B9"/>
-            <w:u w:val="single"/>
-            <w:rFonts w:ascii="Calibri" w:hAnsi="Calibri"/>
-            <w:sz w:val="18"/>
-          </w:rPr>
-          <w:t>kunalshende.me</w:t>
-        </w:r>
-      </w:hyperlink>
+      <w:r>
+        <w:rPr>
+          <w:rFonts w:ascii="Calibri" w:hAnsi="Calibri" w:eastAsia="Calibri"/>
+          <w:b w:val="0"/>
+          <w:i w:val="0"/>
+          <w:color w:val="3C3C3C"/>
+          <w:sz w:val="18"/>
+        </w:rPr>
+        <w:t xml:space="preserve"> </w:t>
+      </w:r>
+      <w:r>
+        <w:rPr>
+          <w:u w:val="single" w:color="2980b8"/>
+          <w:rFonts w:ascii="Calibri" w:hAnsi="Calibri" w:eastAsia="Calibri"/>
+          <w:b w:val="0"/>
+          <w:i w:val="0"/>
+          <w:color w:val="2980B9"/>
+          <w:sz w:val="18"/>
+        </w:rPr>
+        <w:hyperlink r:id="rId10" w:history="1">
+          <w:r>
+            <w:rPr>
+              <w:rStyle w:val="Hyperlink"/>
+            </w:rPr>
+            <w:t>linkedin.com/in/kunal-shende04</w:t>
+          </w:r>
+        </w:hyperlink>
+      </w:r>
+      <w:r>
+        <w:rPr>
+          <w:rFonts w:ascii="Calibri" w:hAnsi="Calibri" w:eastAsia="Calibri"/>
+          <w:b w:val="0"/>
+          <w:i w:val="0"/>
+          <w:color w:val="3C3C3C"/>
+          <w:sz w:val="18"/>
+        </w:rPr>
+        <w:t xml:space="preserve"> </w:t>
+      </w:r>
+      <w:r>
+        <w:rPr>
+          <w:rFonts w:ascii="Calibri" w:hAnsi="Calibri" w:eastAsia="Calibri"/>
+          <w:b w:val="0"/>
+          <w:i w:val="0"/>
+          <w:color w:val="3C3C3C"/>
+          <w:sz w:val="18"/>
+        </w:rPr>
+        <w:t>| GitHub:</w:t>
+      </w:r>
+      <w:r>
+        <w:rPr>
+          <w:rFonts w:ascii="Calibri" w:hAnsi="Calibri" w:eastAsia="Calibri"/>
+          <w:b w:val="0"/>
+          <w:i w:val="0"/>
+          <w:color w:val="3C3C3C"/>
+          <w:sz w:val="18"/>
+        </w:rPr>
+        <w:t xml:space="preserve"> </w:t>
+      </w:r>
+      <w:r>
+        <w:rPr>
+          <w:u w:val="single" w:color="2980b8"/>
+          <w:rFonts w:ascii="Calibri" w:hAnsi="Calibri" w:eastAsia="Calibri"/>
+          <w:b w:val="0"/>
+          <w:i w:val="0"/>
+          <w:color w:val="2980B9"/>
+          <w:sz w:val="18"/>
+        </w:rPr>
+        <w:hyperlink r:id="rId11" w:history="1">
+          <w:r>
+            <w:rPr>
+              <w:rStyle w:val="Hyperlink"/>
+            </w:rPr>
+            <w:t>github.com/KunalShende1436</w:t>
+          </w:r>
+        </w:hyperlink>
+      </w:r>
+      <w:r>
+        <w:rPr>
+          <w:rFonts w:ascii="Calibri" w:hAnsi="Calibri" w:eastAsia="Calibri"/>
+          <w:b w:val="0"/>
+          <w:i w:val="0"/>
+          <w:color w:val="3C3C3C"/>
+          <w:sz w:val="18"/>
+        </w:rPr>
+        <w:t xml:space="preserve"> </w:t>
+      </w:r>
+      <w:r>
+        <w:rPr>
+          <w:rFonts w:ascii="Calibri" w:hAnsi="Calibri" w:eastAsia="Calibri"/>
+          <w:b w:val="0"/>
+          <w:i w:val="0"/>
+          <w:color w:val="3C3C3C"/>
+          <w:sz w:val="18"/>
+        </w:rPr>
+        <w:t>| Portfolio:</w:t>
+      </w:r>
+      <w:r>
+        <w:rPr>
+          <w:rFonts w:ascii="Calibri" w:hAnsi="Calibri" w:eastAsia="Calibri"/>
+          <w:b w:val="0"/>
+          <w:i w:val="0"/>
+          <w:color w:val="3C3C3C"/>
+          <w:sz w:val="18"/>
+        </w:rPr>
+        <w:t xml:space="preserve"> </w:t>
+      </w:r>
+      <w:r>
+        <w:rPr>
+          <w:u w:val="single" w:color="2980b8"/>
+          <w:rFonts w:ascii="Calibri" w:hAnsi="Calibri" w:eastAsia="Calibri"/>
+          <w:b w:val="0"/>
+          <w:i w:val="0"/>
+          <w:color w:val="2980B9"/>
+          <w:sz w:val="18"/>
+        </w:rPr>
+        <w:hyperlink r:id="rId12" w:history="1">
+          <w:r>
+            <w:rPr>
+              <w:rStyle w:val="Hyperlink"/>
+            </w:rPr>
+            <w:t>kunalshende.me</w:t>
+          </w:r>
+        </w:hyperlink>
+      </w:r>
     </w:p>
     <w:p>
       <w:pPr>
-        <w:pBdr>
-          <w:bottom w:val="single" w:sz="4" w:space="1" w:color="000000"/>
-        </w:pBdr>
+        <w:autoSpaceDN w:val="0"/>
+        <w:autoSpaceDE w:val="0"/>
+        <w:widowControl/>
+        <w:spacing w:line="197" w:lineRule="auto" w:before="278" w:after="0"/>
+        <w:ind w:left="30" w:right="0" w:firstLine="0"/>
+        <w:jc w:val="left"/>
       </w:pPr>
       <w:r>
         <w:rPr>
-          <w:rFonts w:ascii="Calibri" w:hAnsi="Calibri"/>
+          <w:rFonts w:ascii="Calibri" w:hAnsi="Calibri" w:eastAsia="Calibri"/>
           <w:b/>
           <w:i w:val="0"/>
           <w:color w:val="000000"/>
@@ -154,27 +284,76 @@
     </w:p>
     <w:p>
       <w:pPr>
-        <w:spacing w:after="40"/>
+        <w:autoSpaceDN w:val="0"/>
+        <w:autoSpaceDE w:val="0"/>
+        <w:widowControl/>
+        <w:spacing w:line="194" w:lineRule="auto" w:before="314" w:after="0"/>
+        <w:ind w:left="30" w:right="0" w:firstLine="0"/>
+        <w:jc w:val="left"/>
       </w:pPr>
       <w:r>
         <w:rPr>
-          <w:rFonts w:ascii="Calibri" w:hAnsi="Calibri"/>
+          <w:rFonts w:ascii="Calibri" w:hAnsi="Calibri" w:eastAsia="Calibri"/>
           <w:b w:val="0"/>
           <w:i w:val="0"/>
+          <w:color w:val="000000"/>
           <w:sz w:val="19"/>
         </w:rPr>
-        <w:t>Computer Science undergraduate with two years of experience in embedded systems, hardware security, and web development. Proficient in vulnerability assessment, penetration testing, and firmware engineering. National competition award winner and Indian Design Patent holder.</w:t>
+        <w:t xml:space="preserve">Computer Science undergraduate with 2+ years of experience in embedded systems, IoT hardware security, and web development. </w:t>
       </w:r>
     </w:p>
     <w:p>
       <w:pPr>
-        <w:pBdr>
-          <w:bottom w:val="single" w:sz="4" w:space="1" w:color="000000"/>
-        </w:pBdr>
+        <w:autoSpaceDN w:val="0"/>
+        <w:autoSpaceDE w:val="0"/>
+        <w:widowControl/>
+        <w:spacing w:line="197" w:lineRule="auto" w:before="78" w:after="0"/>
+        <w:ind w:left="0" w:right="0" w:firstLine="0"/>
+        <w:jc w:val="center"/>
       </w:pPr>
       <w:r>
         <w:rPr>
-          <w:rFonts w:ascii="Calibri" w:hAnsi="Calibri"/>
+          <w:rFonts w:ascii="Calibri" w:hAnsi="Calibri" w:eastAsia="Calibri"/>
+          <w:b w:val="0"/>
+          <w:i w:val="0"/>
+          <w:color w:val="000000"/>
+          <w:sz w:val="19"/>
+        </w:rPr>
+        <w:t xml:space="preserve">Proficient in vulnerability assessment, penetration testing, and firmware engineering on ESP32-S3 and ATmega328P platforms. National </w:t>
+      </w:r>
+    </w:p>
+    <w:p>
+      <w:pPr>
+        <w:autoSpaceDN w:val="0"/>
+        <w:autoSpaceDE w:val="0"/>
+        <w:widowControl/>
+        <w:spacing w:line="197" w:lineRule="auto" w:before="76" w:after="0"/>
+        <w:ind w:left="30" w:right="0" w:firstLine="0"/>
+        <w:jc w:val="left"/>
+      </w:pPr>
+      <w:r>
+        <w:rPr>
+          <w:rFonts w:ascii="Calibri" w:hAnsi="Calibri" w:eastAsia="Calibri"/>
+          <w:b w:val="0"/>
+          <w:i w:val="0"/>
+          <w:color w:val="000000"/>
+          <w:sz w:val="19"/>
+        </w:rPr>
+        <w:t>competition award winner and Indian Design Patent holder.</w:t>
+      </w:r>
+    </w:p>
+    <w:p>
+      <w:pPr>
+        <w:autoSpaceDN w:val="0"/>
+        <w:autoSpaceDE w:val="0"/>
+        <w:widowControl/>
+        <w:spacing w:line="197" w:lineRule="auto" w:before="120" w:after="0"/>
+        <w:ind w:left="30" w:right="0" w:firstLine="0"/>
+        <w:jc w:val="left"/>
+      </w:pPr>
+      <w:r>
+        <w:rPr>
+          <w:rFonts w:ascii="Calibri" w:hAnsi="Calibri" w:eastAsia="Calibri"/>
           <w:b/>
           <w:i w:val="0"/>
           <w:color w:val="000000"/>
@@ -185,23 +364,29 @@
     </w:p>
     <w:p>
       <w:pPr>
-        <w:spacing w:before="0" w:after="20"/>
-        <w:ind w:left="170"/>
+        <w:autoSpaceDN w:val="0"/>
+        <w:autoSpaceDE w:val="0"/>
+        <w:widowControl/>
+        <w:spacing w:line="197" w:lineRule="auto" w:before="312" w:after="0"/>
+        <w:ind w:left="200" w:right="0" w:firstLine="0"/>
+        <w:jc w:val="left"/>
       </w:pPr>
       <w:r>
         <w:rPr>
-          <w:rFonts w:ascii="Calibri" w:hAnsi="Calibri"/>
+          <w:rFonts w:ascii="Calibri" w:hAnsi="Calibri" w:eastAsia="Calibri"/>
           <w:b/>
           <w:i w:val="0"/>
+          <w:color w:val="000000"/>
           <w:sz w:val="19"/>
         </w:rPr>
         <w:t xml:space="preserve">Programming Languages: </w:t>
       </w:r>
       <w:r>
         <w:rPr>
-          <w:rFonts w:ascii="Calibri" w:hAnsi="Calibri"/>
+          <w:rFonts w:ascii="Calibri" w:hAnsi="Calibri" w:eastAsia="Calibri"/>
           <w:b w:val="0"/>
           <w:i w:val="0"/>
+          <w:color w:val="000000"/>
           <w:sz w:val="19"/>
         </w:rPr>
         <w:t>C, Embedded C, C++, Python, TypeScript, Bash</w:t>
@@ -209,23 +394,29 @@
     </w:p>
     <w:p>
       <w:pPr>
-        <w:spacing w:before="0" w:after="20"/>
-        <w:ind w:left="170"/>
+        <w:autoSpaceDN w:val="0"/>
+        <w:autoSpaceDE w:val="0"/>
+        <w:widowControl/>
+        <w:spacing w:line="194" w:lineRule="auto" w:before="98" w:after="0"/>
+        <w:ind w:left="200" w:right="0" w:firstLine="0"/>
+        <w:jc w:val="left"/>
       </w:pPr>
       <w:r>
         <w:rPr>
-          <w:rFonts w:ascii="Calibri" w:hAnsi="Calibri"/>
+          <w:rFonts w:ascii="Calibri" w:hAnsi="Calibri" w:eastAsia="Calibri"/>
           <w:b/>
           <w:i w:val="0"/>
+          <w:color w:val="000000"/>
           <w:sz w:val="19"/>
         </w:rPr>
-        <w:t xml:space="preserve">Hardware Platforms: </w:t>
+        <w:t xml:space="preserve">IoT and Embedded Hardware: </w:t>
       </w:r>
       <w:r>
         <w:rPr>
-          <w:rFonts w:ascii="Calibri" w:hAnsi="Calibri"/>
+          <w:rFonts w:ascii="Calibri" w:hAnsi="Calibri" w:eastAsia="Calibri"/>
           <w:b w:val="0"/>
           <w:i w:val="0"/>
+          <w:color w:val="000000"/>
           <w:sz w:val="19"/>
         </w:rPr>
         <w:t>ESP32, ESP32-S3, Arduino, Raspberry Pi, FreeRTOS, SPI, I2C, UART</w:t>
@@ -233,23 +424,29 @@
     </w:p>
     <w:p>
       <w:pPr>
-        <w:spacing w:before="0" w:after="20"/>
-        <w:ind w:left="170"/>
+        <w:autoSpaceDN w:val="0"/>
+        <w:autoSpaceDE w:val="0"/>
+        <w:widowControl/>
+        <w:spacing w:line="194" w:lineRule="auto" w:before="100" w:after="0"/>
+        <w:ind w:left="200" w:right="0" w:firstLine="0"/>
+        <w:jc w:val="left"/>
       </w:pPr>
       <w:r>
         <w:rPr>
-          <w:rFonts w:ascii="Calibri" w:hAnsi="Calibri"/>
+          <w:rFonts w:ascii="Calibri" w:hAnsi="Calibri" w:eastAsia="Calibri"/>
           <w:b/>
           <w:i w:val="0"/>
+          <w:color w:val="000000"/>
           <w:sz w:val="19"/>
         </w:rPr>
         <w:t xml:space="preserve">Web Development: </w:t>
       </w:r>
       <w:r>
         <w:rPr>
-          <w:rFonts w:ascii="Calibri" w:hAnsi="Calibri"/>
+          <w:rFonts w:ascii="Calibri" w:hAnsi="Calibri" w:eastAsia="Calibri"/>
           <w:b w:val="0"/>
           <w:i w:val="0"/>
+          <w:color w:val="000000"/>
           <w:sz w:val="19"/>
         </w:rPr>
         <w:t>HTML5, CSS3, Bootstrap, Python Flask, WebSockets, Firebase</w:t>
@@ -257,23 +454,29 @@
     </w:p>
     <w:p>
       <w:pPr>
-        <w:spacing w:before="0" w:after="20"/>
-        <w:ind w:left="170"/>
+        <w:autoSpaceDN w:val="0"/>
+        <w:autoSpaceDE w:val="0"/>
+        <w:widowControl/>
+        <w:spacing w:line="197" w:lineRule="auto" w:before="96" w:after="0"/>
+        <w:ind w:left="200" w:right="0" w:firstLine="0"/>
+        <w:jc w:val="left"/>
       </w:pPr>
       <w:r>
         <w:rPr>
-          <w:rFonts w:ascii="Calibri" w:hAnsi="Calibri"/>
+          <w:rFonts w:ascii="Calibri" w:hAnsi="Calibri" w:eastAsia="Calibri"/>
           <w:b/>
           <w:i w:val="0"/>
+          <w:color w:val="000000"/>
           <w:sz w:val="19"/>
         </w:rPr>
         <w:t xml:space="preserve">Databases: </w:t>
       </w:r>
       <w:r>
         <w:rPr>
-          <w:rFonts w:ascii="Calibri" w:hAnsi="Calibri"/>
+          <w:rFonts w:ascii="Calibri" w:hAnsi="Calibri" w:eastAsia="Calibri"/>
           <w:b w:val="0"/>
           <w:i w:val="0"/>
+          <w:color w:val="000000"/>
           <w:sz w:val="19"/>
         </w:rPr>
         <w:t>MySQL, Supabase, Firebase Firestore</w:t>
@@ -281,23 +484,29 @@
     </w:p>
     <w:p>
       <w:pPr>
-        <w:spacing w:before="0" w:after="20"/>
-        <w:ind w:left="170"/>
+        <w:autoSpaceDN w:val="0"/>
+        <w:autoSpaceDE w:val="0"/>
+        <w:widowControl/>
+        <w:spacing w:line="197" w:lineRule="auto" w:before="98" w:after="0"/>
+        <w:ind w:left="200" w:right="0" w:firstLine="0"/>
+        <w:jc w:val="left"/>
       </w:pPr>
       <w:r>
         <w:rPr>
-          <w:rFonts w:ascii="Calibri" w:hAnsi="Calibri"/>
+          <w:rFonts w:ascii="Calibri" w:hAnsi="Calibri" w:eastAsia="Calibri"/>
           <w:b/>
           <w:i w:val="0"/>
+          <w:color w:val="000000"/>
           <w:sz w:val="19"/>
         </w:rPr>
-        <w:t xml:space="preserve">Security Tools: </w:t>
+        <w:t xml:space="preserve">Cybersecurity Tools: </w:t>
       </w:r>
       <w:r>
         <w:rPr>
-          <w:rFonts w:ascii="Calibri" w:hAnsi="Calibri"/>
+          <w:rFonts w:ascii="Calibri" w:hAnsi="Calibri" w:eastAsia="Calibri"/>
           <w:b w:val="0"/>
           <w:i w:val="0"/>
+          <w:color w:val="000000"/>
           <w:sz w:val="19"/>
         </w:rPr>
         <w:t>Burp Suite, Nmap, Wireshark, Metasploit, OWASP Top 10</w:t>
@@ -305,37 +514,46 @@
     </w:p>
     <w:p>
       <w:pPr>
-        <w:spacing w:before="0" w:after="20"/>
-        <w:ind w:left="170"/>
+        <w:autoSpaceDN w:val="0"/>
+        <w:autoSpaceDE w:val="0"/>
+        <w:widowControl/>
+        <w:spacing w:line="197" w:lineRule="auto" w:before="96" w:after="0"/>
+        <w:ind w:left="200" w:right="0" w:firstLine="0"/>
+        <w:jc w:val="left"/>
       </w:pPr>
       <w:r>
         <w:rPr>
-          <w:rFonts w:ascii="Calibri" w:hAnsi="Calibri"/>
+          <w:rFonts w:ascii="Calibri" w:hAnsi="Calibri" w:eastAsia="Calibri"/>
           <w:b/>
           <w:i w:val="0"/>
+          <w:color w:val="000000"/>
           <w:sz w:val="19"/>
         </w:rPr>
         <w:t xml:space="preserve">DevOps and Cloud: </w:t>
       </w:r>
       <w:r>
         <w:rPr>
-          <w:rFonts w:ascii="Calibri" w:hAnsi="Calibri"/>
+          <w:rFonts w:ascii="Calibri" w:hAnsi="Calibri" w:eastAsia="Calibri"/>
           <w:b w:val="0"/>
           <w:i w:val="0"/>
+          <w:color w:val="000000"/>
           <w:sz w:val="19"/>
         </w:rPr>
-        <w:t>Git, GitHub, Docker, Vercel, Google Cloud Platform, Visual Studio Code, Postman</w:t>
+        <w:t>Git, GitHub, Docker, Vercel, Google Cloud Platform, VS Code, Postman</w:t>
       </w:r>
     </w:p>
     <w:p>
       <w:pPr>
-        <w:pBdr>
-          <w:bottom w:val="single" w:sz="4" w:space="1" w:color="000000"/>
-        </w:pBdr>
+        <w:autoSpaceDN w:val="0"/>
+        <w:autoSpaceDE w:val="0"/>
+        <w:widowControl/>
+        <w:spacing w:line="197" w:lineRule="auto" w:before="104" w:after="0"/>
+        <w:ind w:left="30" w:right="0" w:firstLine="0"/>
+        <w:jc w:val="left"/>
       </w:pPr>
       <w:r>
         <w:rPr>
-          <w:rFonts w:ascii="Calibri" w:hAnsi="Calibri"/>
+          <w:rFonts w:ascii="Calibri" w:hAnsi="Calibri" w:eastAsia="Calibri"/>
           <w:b/>
           <w:i w:val="0"/>
           <w:color w:val="000000"/>
@@ -346,20 +564,26 @@
     </w:p>
     <w:p>
       <w:pPr>
-        <w:spacing w:before="80" w:after="0"/>
+        <w:autoSpaceDN w:val="0"/>
+        <w:autoSpaceDE w:val="0"/>
+        <w:widowControl/>
+        <w:spacing w:line="197" w:lineRule="auto" w:before="316" w:after="0"/>
+        <w:ind w:left="30" w:right="0" w:firstLine="0"/>
+        <w:jc w:val="left"/>
       </w:pPr>
       <w:r>
         <w:rPr>
-          <w:rFonts w:ascii="Calibri" w:hAnsi="Calibri"/>
+          <w:rFonts w:ascii="Calibri" w:hAnsi="Calibri" w:eastAsia="Calibri"/>
           <w:b/>
           <w:i w:val="0"/>
+          <w:color w:val="000000"/>
           <w:sz w:val="20"/>
         </w:rPr>
         <w:t>Independent Security Researcher</w:t>
       </w:r>
       <w:r>
         <w:rPr>
-          <w:rFonts w:ascii="Calibri" w:hAnsi="Calibri"/>
+          <w:rFonts w:ascii="Calibri" w:hAnsi="Calibri" w:eastAsia="Calibri"/>
           <w:b w:val="0"/>
           <w:i/>
           <w:color w:val="505050"/>
@@ -369,7 +593,7 @@
       </w:r>
       <w:r>
         <w:rPr>
-          <w:rFonts w:ascii="Calibri" w:hAnsi="Calibri"/>
+          <w:rFonts w:ascii="Calibri" w:hAnsi="Calibri" w:eastAsia="Calibri"/>
           <w:b w:val="0"/>
           <w:i/>
           <w:color w:val="646464"/>
@@ -380,68 +604,154 @@
     </w:p>
     <w:p>
       <w:pPr>
-        <w:pStyle w:val="ListBullet"/>
-        <w:spacing w:before="0" w:after="20"/>
-        <w:ind w:left="340"/>
+        <w:autoSpaceDN w:val="0"/>
+        <w:tabs>
+          <w:tab w:pos="370" w:val="left"/>
+        </w:tabs>
+        <w:autoSpaceDE w:val="0"/>
+        <w:widowControl/>
+        <w:spacing w:line="245" w:lineRule="auto" w:before="42" w:after="0"/>
+        <w:ind w:left="10" w:right="0" w:firstLine="0"/>
+        <w:jc w:val="left"/>
       </w:pPr>
       <w:r>
         <w:rPr>
-          <w:rFonts w:ascii="Calibri" w:hAnsi="Calibri"/>
+          <w:rFonts w:ascii="Symbol" w:hAnsi="Symbol" w:eastAsia="Symbol"/>
           <w:b w:val="0"/>
           <w:i w:val="0"/>
+          <w:color w:val="000000"/>
+          <w:sz w:val="20"/>
+        </w:rPr>
+        <w:t>•</w:t>
+      </w:r>
+      <w:r>
+        <w:tab/>
+      </w:r>
+      <w:r>
+        <w:rPr>
+          <w:rFonts w:ascii="Calibri" w:hAnsi="Calibri" w:eastAsia="Calibri"/>
+          <w:b w:val="0"/>
+          <w:i w:val="0"/>
+          <w:color w:val="000000"/>
           <w:sz w:val="19"/>
         </w:rPr>
-        <w:t>Architected three secure hardware prototypes for Internet of Things applications, reducing firmware attack surfaces by 40 percent.</w:t>
+        <w:t xml:space="preserve">Architected 3 secure IoT prototypes on ESP32-S3 and ATmega328P, reducing firmware attack surfaces by 40% with memory-safe </w:t>
       </w:r>
     </w:p>
     <w:p>
       <w:pPr>
-        <w:pStyle w:val="ListBullet"/>
-        <w:spacing w:before="0" w:after="20"/>
-        <w:ind w:left="340"/>
+        <w:autoSpaceDN w:val="0"/>
+        <w:autoSpaceDE w:val="0"/>
+        <w:widowControl/>
+        <w:spacing w:line="194" w:lineRule="auto" w:before="78" w:after="0"/>
+        <w:ind w:left="370" w:right="0" w:firstLine="0"/>
+        <w:jc w:val="left"/>
       </w:pPr>
       <w:r>
         <w:rPr>
-          <w:rFonts w:ascii="Calibri" w:hAnsi="Calibri"/>
+          <w:rFonts w:ascii="Calibri" w:hAnsi="Calibri" w:eastAsia="Calibri"/>
           <w:b w:val="0"/>
           <w:i w:val="0"/>
+          <w:color w:val="000000"/>
           <w:sz w:val="19"/>
         </w:rPr>
-        <w:t>Identified 15 critical security vulnerabilities in 10 controlled test environments using industry standard assessment frameworks.</w:t>
+        <w:t>coding practices.</w:t>
       </w:r>
     </w:p>
     <w:p>
       <w:pPr>
-        <w:pStyle w:val="ListBullet"/>
-        <w:spacing w:before="0" w:after="20"/>
-        <w:ind w:left="340"/>
+        <w:autoSpaceDN w:val="0"/>
+        <w:tabs>
+          <w:tab w:pos="370" w:val="left"/>
+        </w:tabs>
+        <w:autoSpaceDE w:val="0"/>
+        <w:widowControl/>
+        <w:spacing w:line="242" w:lineRule="auto" w:before="42" w:after="0"/>
+        <w:ind w:left="10" w:right="0" w:firstLine="0"/>
+        <w:jc w:val="left"/>
       </w:pPr>
       <w:r>
         <w:rPr>
-          <w:rFonts w:ascii="Calibri" w:hAnsi="Calibri"/>
+          <w:rFonts w:ascii="Symbol" w:hAnsi="Symbol" w:eastAsia="Symbol"/>
           <w:b w:val="0"/>
           <w:i w:val="0"/>
+          <w:color w:val="000000"/>
+          <w:sz w:val="20"/>
+        </w:rPr>
+        <w:t>•</w:t>
+      </w:r>
+      <w:r>
+        <w:tab/>
+      </w:r>
+      <w:r>
+        <w:rPr>
+          <w:rFonts w:ascii="Calibri" w:hAnsi="Calibri" w:eastAsia="Calibri"/>
+          <w:b w:val="0"/>
+          <w:i w:val="0"/>
+          <w:color w:val="000000"/>
           <w:sz w:val="19"/>
         </w:rPr>
-        <w:t>Reduced network anomalies by 25 percent through packet-level traffic analysis and proactive system hardening measures.</w:t>
+        <w:t>Discovered 15+ critical vulnerabilities in 10 controlled environments using OWASP and NIST assessment frameworks.</w:t>
       </w:r>
     </w:p>
     <w:p>
       <w:pPr>
-        <w:spacing w:before="80" w:after="0"/>
+        <w:autoSpaceDN w:val="0"/>
+        <w:tabs>
+          <w:tab w:pos="370" w:val="left"/>
+        </w:tabs>
+        <w:autoSpaceDE w:val="0"/>
+        <w:widowControl/>
+        <w:spacing w:line="245" w:lineRule="auto" w:before="36" w:after="0"/>
+        <w:ind w:left="10" w:right="0" w:firstLine="0"/>
+        <w:jc w:val="left"/>
       </w:pPr>
       <w:r>
         <w:rPr>
-          <w:rFonts w:ascii="Calibri" w:hAnsi="Calibri"/>
+          <w:rFonts w:ascii="Symbol" w:hAnsi="Symbol" w:eastAsia="Symbol"/>
+          <w:b w:val="0"/>
+          <w:i w:val="0"/>
+          <w:color w:val="000000"/>
+          <w:sz w:val="20"/>
+        </w:rPr>
+        <w:t>•</w:t>
+      </w:r>
+      <w:r>
+        <w:tab/>
+      </w:r>
+      <w:r>
+        <w:rPr>
+          <w:rFonts w:ascii="Calibri" w:hAnsi="Calibri" w:eastAsia="Calibri"/>
+          <w:b w:val="0"/>
+          <w:i w:val="0"/>
+          <w:color w:val="000000"/>
+          <w:sz w:val="19"/>
+        </w:rPr>
+        <w:t>Mitigated network anomalies by 25% via packet-level traffic analysis and proactive system hardening across 5 IoT deployments.</w:t>
+      </w:r>
+    </w:p>
+    <w:p>
+      <w:pPr>
+        <w:autoSpaceDN w:val="0"/>
+        <w:autoSpaceDE w:val="0"/>
+        <w:widowControl/>
+        <w:spacing w:line="194" w:lineRule="auto" w:before="162" w:after="0"/>
+        <w:ind w:left="30" w:right="0" w:firstLine="0"/>
+        <w:jc w:val="left"/>
+      </w:pPr>
+      <w:r>
+        <w:rPr>
+          <w:rFonts w:ascii="Calibri" w:hAnsi="Calibri" w:eastAsia="Calibri"/>
           <w:b/>
           <w:i w:val="0"/>
+          <w:color w:val="000000"/>
           <w:sz w:val="20"/>
         </w:rPr>
         <w:t>Web Exploit Hunting Intern</w:t>
       </w:r>
       <w:r>
         <w:rPr>
-          <w:rFonts w:ascii="Calibri" w:hAnsi="Calibri"/>
+          <w:rFonts w:ascii="Calibri" w:hAnsi="Calibri" w:eastAsia="Calibri"/>
           <w:b w:val="0"/>
           <w:i/>
           <w:color w:val="505050"/>
@@ -451,7 +761,7 @@
       </w:r>
       <w:r>
         <w:rPr>
-          <w:rFonts w:ascii="Calibri" w:hAnsi="Calibri"/>
+          <w:rFonts w:ascii="Calibri" w:hAnsi="Calibri" w:eastAsia="Calibri"/>
           <w:b w:val="0"/>
           <w:i/>
           <w:color w:val="646464"/>
@@ -462,52 +772,118 @@
     </w:p>
     <w:p>
       <w:pPr>
-        <w:pStyle w:val="ListBullet"/>
-        <w:spacing w:before="0" w:after="20"/>
-        <w:ind w:left="340"/>
+        <w:autoSpaceDN w:val="0"/>
+        <w:tabs>
+          <w:tab w:pos="370" w:val="left"/>
+        </w:tabs>
+        <w:autoSpaceDE w:val="0"/>
+        <w:widowControl/>
+        <w:spacing w:line="242" w:lineRule="auto" w:before="44" w:after="0"/>
+        <w:ind w:left="10" w:right="0" w:firstLine="0"/>
+        <w:jc w:val="left"/>
       </w:pPr>
       <w:r>
         <w:rPr>
-          <w:rFonts w:ascii="Calibri" w:hAnsi="Calibri"/>
+          <w:rFonts w:ascii="Symbol" w:hAnsi="Symbol" w:eastAsia="Symbol"/>
           <w:b w:val="0"/>
           <w:i w:val="0"/>
+          <w:color w:val="000000"/>
+          <w:sz w:val="20"/>
+        </w:rPr>
+        <w:t>•</w:t>
+      </w:r>
+      <w:r>
+        <w:tab/>
+      </w:r>
+      <w:r>
+        <w:rPr>
+          <w:rFonts w:ascii="Calibri" w:hAnsi="Calibri" w:eastAsia="Calibri"/>
+          <w:b w:val="0"/>
+          <w:i w:val="0"/>
+          <w:color w:val="000000"/>
           <w:sz w:val="19"/>
         </w:rPr>
-        <w:t>Detected 12 security flaws including injection and scripting vulnerabilities in eight web applications during testing exercises.</w:t>
+        <w:t xml:space="preserve">Detected 12 security flaws including SQL injection and XSS within 8 web applications during structured penetration testing </w:t>
       </w:r>
     </w:p>
     <w:p>
       <w:pPr>
-        <w:pStyle w:val="ListBullet"/>
-        <w:spacing w:before="0" w:after="20"/>
-        <w:ind w:left="340"/>
+        <w:autoSpaceDN w:val="0"/>
+        <w:autoSpaceDE w:val="0"/>
+        <w:widowControl/>
+        <w:spacing w:line="197" w:lineRule="auto" w:before="78" w:after="0"/>
+        <w:ind w:left="370" w:right="0" w:firstLine="0"/>
+        <w:jc w:val="left"/>
       </w:pPr>
       <w:r>
         <w:rPr>
-          <w:rFonts w:ascii="Calibri" w:hAnsi="Calibri"/>
+          <w:rFonts w:ascii="Calibri" w:hAnsi="Calibri" w:eastAsia="Calibri"/>
           <w:b w:val="0"/>
           <w:i w:val="0"/>
+          <w:color w:val="000000"/>
           <w:sz w:val="19"/>
         </w:rPr>
-        <w:t>Compiled detailed vulnerability reports with severity classifications, accelerating team remediation timelines by 30 percent.</w:t>
+        <w:t>exercises.</w:t>
       </w:r>
     </w:p>
     <w:p>
       <w:pPr>
-        <w:spacing w:before="80" w:after="0"/>
+        <w:autoSpaceDN w:val="0"/>
+        <w:tabs>
+          <w:tab w:pos="370" w:val="left"/>
+        </w:tabs>
+        <w:autoSpaceDE w:val="0"/>
+        <w:widowControl/>
+        <w:spacing w:line="242" w:lineRule="auto" w:before="38" w:after="0"/>
+        <w:ind w:left="10" w:right="0" w:firstLine="0"/>
+        <w:jc w:val="left"/>
       </w:pPr>
       <w:r>
         <w:rPr>
-          <w:rFonts w:ascii="Calibri" w:hAnsi="Calibri"/>
+          <w:rFonts w:ascii="Symbol" w:hAnsi="Symbol" w:eastAsia="Symbol"/>
+          <w:b w:val="0"/>
+          <w:i w:val="0"/>
+          <w:color w:val="000000"/>
+          <w:sz w:val="20"/>
+        </w:rPr>
+        <w:t>•</w:t>
+      </w:r>
+      <w:r>
+        <w:tab/>
+      </w:r>
+      <w:r>
+        <w:rPr>
+          <w:rFonts w:ascii="Calibri" w:hAnsi="Calibri" w:eastAsia="Calibri"/>
+          <w:b w:val="0"/>
+          <w:i w:val="0"/>
+          <w:color w:val="000000"/>
+          <w:sz w:val="19"/>
+        </w:rPr>
+        <w:t>Compiled detailed vulnerability reports with severity ratings, accelerating remediation timelines by 30% for the development team.</w:t>
+      </w:r>
+    </w:p>
+    <w:p>
+      <w:pPr>
+        <w:autoSpaceDN w:val="0"/>
+        <w:autoSpaceDE w:val="0"/>
+        <w:widowControl/>
+        <w:spacing w:line="194" w:lineRule="auto" w:before="162" w:after="0"/>
+        <w:ind w:left="30" w:right="0" w:firstLine="0"/>
+        <w:jc w:val="left"/>
+      </w:pPr>
+      <w:r>
+        <w:rPr>
+          <w:rFonts w:ascii="Calibri" w:hAnsi="Calibri" w:eastAsia="Calibri"/>
           <w:b/>
           <w:i w:val="0"/>
+          <w:color w:val="000000"/>
           <w:sz w:val="20"/>
         </w:rPr>
         <w:t>Cybersecurity Intern</w:t>
       </w:r>
       <w:r>
         <w:rPr>
-          <w:rFonts w:ascii="Calibri" w:hAnsi="Calibri"/>
+          <w:rFonts w:ascii="Calibri" w:hAnsi="Calibri" w:eastAsia="Calibri"/>
           <w:b w:val="0"/>
           <w:i/>
           <w:color w:val="505050"/>
@@ -517,7 +893,7 @@
       </w:r>
       <w:r>
         <w:rPr>
-          <w:rFonts w:ascii="Calibri" w:hAnsi="Calibri"/>
+          <w:rFonts w:ascii="Calibri" w:hAnsi="Calibri" w:eastAsia="Calibri"/>
           <w:b w:val="0"/>
           <w:i/>
           <w:color w:val="646464"/>
@@ -528,52 +904,118 @@
     </w:p>
     <w:p>
       <w:pPr>
-        <w:pStyle w:val="ListBullet"/>
-        <w:spacing w:before="0" w:after="20"/>
-        <w:ind w:left="340"/>
+        <w:autoSpaceDN w:val="0"/>
+        <w:tabs>
+          <w:tab w:pos="370" w:val="left"/>
+        </w:tabs>
+        <w:autoSpaceDE w:val="0"/>
+        <w:widowControl/>
+        <w:spacing w:line="245" w:lineRule="auto" w:before="44" w:after="0"/>
+        <w:ind w:left="10" w:right="0" w:firstLine="0"/>
+        <w:jc w:val="left"/>
       </w:pPr>
       <w:r>
         <w:rPr>
-          <w:rFonts w:ascii="Calibri" w:hAnsi="Calibri"/>
+          <w:rFonts w:ascii="Symbol" w:hAnsi="Symbol" w:eastAsia="Symbol"/>
           <w:b w:val="0"/>
           <w:i w:val="0"/>
+          <w:color w:val="000000"/>
+          <w:sz w:val="20"/>
+        </w:rPr>
+        <w:t>•</w:t>
+      </w:r>
+      <w:r>
+        <w:tab/>
+      </w:r>
+      <w:r>
+        <w:rPr>
+          <w:rFonts w:ascii="Calibri" w:hAnsi="Calibri" w:eastAsia="Calibri"/>
+          <w:b w:val="0"/>
+          <w:i w:val="0"/>
+          <w:color w:val="000000"/>
           <w:sz w:val="19"/>
         </w:rPr>
-        <w:t>Reviewed 500 network packet captures and firewall configurations, strengthening endpoint protection for three cloud environments.</w:t>
+        <w:t>Analyzed 500+ packet captures and firewall rule sets, strengthening endpoint protection for 3 cloud environments.</w:t>
       </w:r>
     </w:p>
     <w:p>
       <w:pPr>
-        <w:pStyle w:val="ListBullet"/>
-        <w:spacing w:before="0" w:after="20"/>
-        <w:ind w:left="340"/>
+        <w:autoSpaceDN w:val="0"/>
+        <w:tabs>
+          <w:tab w:pos="370" w:val="left"/>
+        </w:tabs>
+        <w:autoSpaceDE w:val="0"/>
+        <w:widowControl/>
+        <w:spacing w:line="242" w:lineRule="auto" w:before="38" w:after="0"/>
+        <w:ind w:left="10" w:right="0" w:firstLine="0"/>
+        <w:jc w:val="left"/>
       </w:pPr>
       <w:r>
         <w:rPr>
-          <w:rFonts w:ascii="Calibri" w:hAnsi="Calibri"/>
+          <w:rFonts w:ascii="Symbol" w:hAnsi="Symbol" w:eastAsia="Symbol"/>
           <w:b w:val="0"/>
           <w:i w:val="0"/>
+          <w:color w:val="000000"/>
+          <w:sz w:val="20"/>
+        </w:rPr>
+        <w:t>•</w:t>
+      </w:r>
+      <w:r>
+        <w:tab/>
+      </w:r>
+      <w:r>
+        <w:rPr>
+          <w:rFonts w:ascii="Calibri" w:hAnsi="Calibri" w:eastAsia="Calibri"/>
+          <w:b w:val="0"/>
+          <w:i w:val="0"/>
+          <w:color w:val="000000"/>
           <w:sz w:val="19"/>
         </w:rPr>
-        <w:t>Earned four industry certifications in security operations, network security, cybersecurity, and cloud security disciplines.</w:t>
+        <w:t xml:space="preserve">Earned 4 industry certifications from Palo Alto Networks in Security Operations, Network Security, Cybersecurity, and Cloud </w:t>
       </w:r>
     </w:p>
     <w:p>
       <w:pPr>
-        <w:spacing w:before="80" w:after="0"/>
+        <w:autoSpaceDN w:val="0"/>
+        <w:autoSpaceDE w:val="0"/>
+        <w:widowControl/>
+        <w:spacing w:line="194" w:lineRule="auto" w:before="76" w:after="0"/>
+        <w:ind w:left="370" w:right="0" w:firstLine="0"/>
+        <w:jc w:val="left"/>
       </w:pPr>
       <w:r>
         <w:rPr>
-          <w:rFonts w:ascii="Calibri" w:hAnsi="Calibri"/>
+          <w:rFonts w:ascii="Calibri" w:hAnsi="Calibri" w:eastAsia="Calibri"/>
+          <w:b w:val="0"/>
+          <w:i w:val="0"/>
+          <w:color w:val="000000"/>
+          <w:sz w:val="19"/>
+        </w:rPr>
+        <w:t>Security.</w:t>
+      </w:r>
+    </w:p>
+    <w:p>
+      <w:pPr>
+        <w:autoSpaceDN w:val="0"/>
+        <w:autoSpaceDE w:val="0"/>
+        <w:widowControl/>
+        <w:spacing w:line="194" w:lineRule="auto" w:before="162" w:after="0"/>
+        <w:ind w:left="30" w:right="0" w:firstLine="0"/>
+        <w:jc w:val="left"/>
+      </w:pPr>
+      <w:r>
+        <w:rPr>
+          <w:rFonts w:ascii="Calibri" w:hAnsi="Calibri" w:eastAsia="Calibri"/>
           <w:b/>
           <w:i w:val="0"/>
+          <w:color w:val="000000"/>
           <w:sz w:val="20"/>
         </w:rPr>
         <w:t>Java Full Stack Developer Virtual Intern</w:t>
       </w:r>
       <w:r>
         <w:rPr>
-          <w:rFonts w:ascii="Calibri" w:hAnsi="Calibri"/>
+          <w:rFonts w:ascii="Calibri" w:hAnsi="Calibri" w:eastAsia="Calibri"/>
           <w:b w:val="0"/>
           <w:i/>
           <w:color w:val="505050"/>
@@ -583,7 +1025,7 @@
       </w:r>
       <w:r>
         <w:rPr>
-          <w:rFonts w:ascii="Calibri" w:hAnsi="Calibri"/>
+          <w:rFonts w:ascii="Calibri" w:hAnsi="Calibri" w:eastAsia="Calibri"/>
           <w:b w:val="0"/>
           <w:i/>
           <w:color w:val="646464"/>
@@ -594,36 +1036,82 @@
     </w:p>
     <w:p>
       <w:pPr>
-        <w:pStyle w:val="ListBullet"/>
-        <w:spacing w:before="0" w:after="20"/>
-        <w:ind w:left="340"/>
+        <w:autoSpaceDN w:val="0"/>
+        <w:tabs>
+          <w:tab w:pos="370" w:val="left"/>
+        </w:tabs>
+        <w:autoSpaceDE w:val="0"/>
+        <w:widowControl/>
+        <w:spacing w:line="245" w:lineRule="auto" w:before="44" w:after="0"/>
+        <w:ind w:left="10" w:right="0" w:firstLine="0"/>
+        <w:jc w:val="left"/>
       </w:pPr>
       <w:r>
         <w:rPr>
-          <w:rFonts w:ascii="Calibri" w:hAnsi="Calibri"/>
+          <w:rFonts w:ascii="Symbol" w:hAnsi="Symbol" w:eastAsia="Symbol"/>
           <w:b w:val="0"/>
           <w:i w:val="0"/>
+          <w:color w:val="000000"/>
+          <w:sz w:val="20"/>
+        </w:rPr>
+        <w:t>•</w:t>
+      </w:r>
+      <w:r>
+        <w:tab/>
+      </w:r>
+      <w:r>
+        <w:rPr>
+          <w:rFonts w:ascii="Calibri" w:hAnsi="Calibri" w:eastAsia="Calibri"/>
+          <w:b w:val="0"/>
+          <w:i w:val="0"/>
+          <w:color w:val="000000"/>
           <w:sz w:val="19"/>
         </w:rPr>
-        <w:t>Completed a structured 12-week training program in application development, database integration, and backend service design.</w:t>
+        <w:t xml:space="preserve">Completed a 12-week program covering full-stack application development, relational database integration, and backend service </w:t>
       </w:r>
     </w:p>
     <w:p>
       <w:pPr>
-        <w:spacing w:before="80" w:after="0"/>
+        <w:autoSpaceDN w:val="0"/>
+        <w:autoSpaceDE w:val="0"/>
+        <w:widowControl/>
+        <w:spacing w:line="197" w:lineRule="auto" w:before="74" w:after="0"/>
+        <w:ind w:left="370" w:right="0" w:firstLine="0"/>
+        <w:jc w:val="left"/>
       </w:pPr>
       <w:r>
         <w:rPr>
-          <w:rFonts w:ascii="Calibri" w:hAnsi="Calibri"/>
+          <w:rFonts w:ascii="Calibri" w:hAnsi="Calibri" w:eastAsia="Calibri"/>
+          <w:b w:val="0"/>
+          <w:i w:val="0"/>
+          <w:color w:val="000000"/>
+          <w:sz w:val="19"/>
+        </w:rPr>
+        <w:t>design.</w:t>
+      </w:r>
+    </w:p>
+    <w:p>
+      <w:pPr>
+        <w:autoSpaceDN w:val="0"/>
+        <w:autoSpaceDE w:val="0"/>
+        <w:widowControl/>
+        <w:spacing w:line="197" w:lineRule="auto" w:before="160" w:after="0"/>
+        <w:ind w:left="30" w:right="0" w:firstLine="0"/>
+        <w:jc w:val="left"/>
+      </w:pPr>
+      <w:r>
+        <w:rPr>
+          <w:rFonts w:ascii="Calibri" w:hAnsi="Calibri" w:eastAsia="Calibri"/>
           <w:b/>
           <w:i w:val="0"/>
+          <w:color w:val="000000"/>
           <w:sz w:val="20"/>
         </w:rPr>
         <w:t>Cloud Virtual Intern</w:t>
       </w:r>
       <w:r>
         <w:rPr>
-          <w:rFonts w:ascii="Calibri" w:hAnsi="Calibri"/>
+          <w:rFonts w:ascii="Calibri" w:hAnsi="Calibri" w:eastAsia="Calibri"/>
           <w:b w:val="0"/>
           <w:i/>
           <w:color w:val="505050"/>
@@ -633,7 +1121,7 @@
       </w:r>
       <w:r>
         <w:rPr>
-          <w:rFonts w:ascii="Calibri" w:hAnsi="Calibri"/>
+          <w:rFonts w:ascii="Calibri" w:hAnsi="Calibri" w:eastAsia="Calibri"/>
           <w:b w:val="0"/>
           <w:i/>
           <w:color w:val="646464"/>
@@ -644,36 +1132,62 @@
     </w:p>
     <w:p>
       <w:pPr>
-        <w:pStyle w:val="ListBullet"/>
-        <w:spacing w:before="0" w:after="20"/>
-        <w:ind w:left="340"/>
+        <w:autoSpaceDN w:val="0"/>
+        <w:tabs>
+          <w:tab w:pos="370" w:val="left"/>
+        </w:tabs>
+        <w:autoSpaceDE w:val="0"/>
+        <w:widowControl/>
+        <w:spacing w:line="245" w:lineRule="auto" w:before="40" w:after="0"/>
+        <w:ind w:left="10" w:right="0" w:firstLine="0"/>
+        <w:jc w:val="left"/>
       </w:pPr>
       <w:r>
         <w:rPr>
-          <w:rFonts w:ascii="Calibri" w:hAnsi="Calibri"/>
+          <w:rFonts w:ascii="Symbol" w:hAnsi="Symbol" w:eastAsia="Symbol"/>
           <w:b w:val="0"/>
           <w:i w:val="0"/>
+          <w:color w:val="000000"/>
+          <w:sz w:val="20"/>
+        </w:rPr>
+        <w:t>•</w:t>
+      </w:r>
+      <w:r>
+        <w:tab/>
+      </w:r>
+      <w:r>
+        <w:rPr>
+          <w:rFonts w:ascii="Calibri" w:hAnsi="Calibri" w:eastAsia="Calibri"/>
+          <w:b w:val="0"/>
+          <w:i w:val="0"/>
+          <w:color w:val="000000"/>
           <w:sz w:val="19"/>
         </w:rPr>
-        <w:t>Studied 10 core cloud infrastructure services over an eight-week hands-on laboratory curriculum covering compute and storage.</w:t>
+        <w:t>Studied 10+ core AWS services including EC2, S3, VPC, and IAM over an 8-week hands-on lab curriculum.</w:t>
       </w:r>
     </w:p>
     <w:p>
       <w:pPr>
-        <w:spacing w:before="80" w:after="0"/>
+        <w:autoSpaceDN w:val="0"/>
+        <w:autoSpaceDE w:val="0"/>
+        <w:widowControl/>
+        <w:spacing w:line="197" w:lineRule="auto" w:before="160" w:after="0"/>
+        <w:ind w:left="30" w:right="0" w:firstLine="0"/>
+        <w:jc w:val="left"/>
       </w:pPr>
       <w:r>
         <w:rPr>
-          <w:rFonts w:ascii="Calibri" w:hAnsi="Calibri"/>
+          <w:rFonts w:ascii="Calibri" w:hAnsi="Calibri" w:eastAsia="Calibri"/>
           <w:b/>
           <w:i w:val="0"/>
+          <w:color w:val="000000"/>
           <w:sz w:val="20"/>
         </w:rPr>
         <w:t>Android Developer Virtual Intern</w:t>
       </w:r>
       <w:r>
         <w:rPr>
-          <w:rFonts w:ascii="Calibri" w:hAnsi="Calibri"/>
+          <w:rFonts w:ascii="Calibri" w:hAnsi="Calibri" w:eastAsia="Calibri"/>
           <w:b w:val="0"/>
           <w:i/>
           <w:color w:val="505050"/>
@@ -683,7 +1197,7 @@
       </w:r>
       <w:r>
         <w:rPr>
-          <w:rFonts w:ascii="Calibri" w:hAnsi="Calibri"/>
+          <w:rFonts w:ascii="Calibri" w:hAnsi="Calibri" w:eastAsia="Calibri"/>
           <w:b w:val="0"/>
           <w:i/>
           <w:color w:val="646464"/>
@@ -694,29 +1208,52 @@
     </w:p>
     <w:p>
       <w:pPr>
-        <w:pStyle w:val="ListBullet"/>
-        <w:spacing w:before="0" w:after="20"/>
-        <w:ind w:left="340"/>
+        <w:autoSpaceDN w:val="0"/>
+        <w:tabs>
+          <w:tab w:pos="370" w:val="left"/>
+        </w:tabs>
+        <w:autoSpaceDE w:val="0"/>
+        <w:widowControl/>
+        <w:spacing w:line="245" w:lineRule="auto" w:before="40" w:after="0"/>
+        <w:ind w:left="10" w:right="0" w:firstLine="0"/>
+        <w:jc w:val="left"/>
       </w:pPr>
       <w:r>
         <w:rPr>
-          <w:rFonts w:ascii="Calibri" w:hAnsi="Calibri"/>
+          <w:rFonts w:ascii="Symbol" w:hAnsi="Symbol" w:eastAsia="Symbol"/>
           <w:b w:val="0"/>
           <w:i w:val="0"/>
+          <w:color w:val="000000"/>
+          <w:sz w:val="20"/>
+        </w:rPr>
+        <w:t>•</w:t>
+      </w:r>
+      <w:r>
+        <w:tab/>
+      </w:r>
+      <w:r>
+        <w:rPr>
+          <w:rFonts w:ascii="Calibri" w:hAnsi="Calibri" w:eastAsia="Calibri"/>
+          <w:b w:val="0"/>
+          <w:i w:val="0"/>
+          <w:color w:val="000000"/>
           <w:sz w:val="19"/>
         </w:rPr>
-        <w:t>Explored eight mobile application development modules covering interface design, lifecycle management, and local data storage.</w:t>
+        <w:t>Explored 8 Android modules on Material Design, activity lifecycle management, and local SQLite data persistence.</w:t>
       </w:r>
     </w:p>
     <w:p>
       <w:pPr>
-        <w:pBdr>
-          <w:bottom w:val="single" w:sz="4" w:space="1" w:color="000000"/>
-        </w:pBdr>
+        <w:autoSpaceDN w:val="0"/>
+        <w:autoSpaceDE w:val="0"/>
+        <w:widowControl/>
+        <w:spacing w:line="197" w:lineRule="auto" w:before="102" w:after="0"/>
+        <w:ind w:left="30" w:right="0" w:firstLine="0"/>
+        <w:jc w:val="left"/>
       </w:pPr>
       <w:r>
         <w:rPr>
-          <w:rFonts w:ascii="Calibri" w:hAnsi="Calibri"/>
+          <w:rFonts w:ascii="Calibri" w:hAnsi="Calibri" w:eastAsia="Calibri"/>
           <w:b/>
           <w:i w:val="0"/>
           <w:color w:val="000000"/>
@@ -727,45 +1264,252 @@
     </w:p>
     <w:p>
       <w:pPr>
-        <w:spacing w:before="80" w:after="0"/>
+        <w:autoSpaceDN w:val="0"/>
+        <w:autoSpaceDE w:val="0"/>
+        <w:widowControl/>
+        <w:spacing w:line="197" w:lineRule="auto" w:before="316" w:after="0"/>
+        <w:ind w:left="30" w:right="0" w:firstLine="0"/>
+        <w:jc w:val="left"/>
       </w:pPr>
       <w:r>
         <w:rPr>
-          <w:rFonts w:ascii="Calibri" w:hAnsi="Calibri"/>
+          <w:rFonts w:ascii="Calibri" w:hAnsi="Calibri" w:eastAsia="Calibri"/>
           <w:b/>
           <w:i w:val="0"/>
+          <w:color w:val="000000"/>
           <w:sz w:val="20"/>
         </w:rPr>
         <w:t>ZeroTrace - Cybersecurity Audit Device</w:t>
       </w:r>
       <w:r>
         <w:rPr>
-          <w:rFonts w:ascii="Calibri" w:hAnsi="Calibri"/>
+          <w:rFonts w:ascii="Calibri" w:hAnsi="Calibri" w:eastAsia="Calibri"/>
           <w:b w:val="0"/>
           <w:i/>
           <w:color w:val="505050"/>
           <w:sz w:val="19"/>
         </w:rPr>
-        <w:t xml:space="preserve"> | ESP32-S3, FreeRTOS, C++</w:t>
+        <w:t xml:space="preserve"> | ESP32-S3, FreeRTOS, C++, USB-HID</w:t>
       </w:r>
       <w:r>
-        <w:t xml:space="preserve"> | </w:t>
+        <w:rPr>
+          <w:rFonts w:ascii="Calibri" w:hAnsi="Calibri" w:eastAsia="Calibri"/>
+          <w:b w:val="0"/>
+          <w:i w:val="0"/>
+          <w:color w:val="000000"/>
+          <w:sz w:val="20"/>
+        </w:rPr>
+        <w:t xml:space="preserve"> |</w:t>
       </w:r>
-      <w:hyperlink r:id="rId13">
-        <w:r>
-          <w:rPr>
-            <w:color w:val="2980B9"/>
-            <w:u w:val="single"/>
-            <w:b/>
-            <w:rFonts w:ascii="Calibri" w:hAnsi="Calibri"/>
-            <w:sz w:val="18"/>
-          </w:rPr>
-          <w:t>[GitHub Repo]</w:t>
-        </w:r>
-      </w:hyperlink>
       <w:r>
         <w:rPr>
-          <w:rFonts w:ascii="Calibri" w:hAnsi="Calibri"/>
+          <w:rFonts w:ascii="Calibri" w:hAnsi="Calibri" w:eastAsia="Calibri"/>
+          <w:b w:val="0"/>
+          <w:i w:val="0"/>
+          <w:color w:val="000000"/>
+          <w:sz w:val="20"/>
+        </w:rPr>
+        <w:t xml:space="preserve"> </w:t>
+      </w:r>
+      <w:r>
+        <w:rPr>
+          <w:u w:val="single" w:color="2980b8"/>
+          <w:rFonts w:ascii="Calibri" w:hAnsi="Calibri" w:eastAsia="Calibri"/>
+          <w:b/>
+          <w:i w:val="0"/>
+          <w:color w:val="2980B9"/>
+          <w:sz w:val="18"/>
+        </w:rPr>
+        <w:hyperlink r:id="rId13" w:history="1">
+          <w:r>
+            <w:rPr>
+              <w:rStyle w:val="Hyperlink"/>
+            </w:rPr>
+            <w:t>[GitHub Repo]</w:t>
+          </w:r>
+        </w:hyperlink>
+      </w:r>
+      <w:r>
+        <w:rPr>
+          <w:rFonts w:ascii="Calibri" w:hAnsi="Calibri" w:eastAsia="Calibri"/>
+          <w:b w:val="0"/>
+          <w:i/>
+          <w:color w:val="646464"/>
+          <w:sz w:val="19"/>
+        </w:rPr>
+        <w:t xml:space="preserve"> </w:t>
+      </w:r>
+      <w:r>
+        <w:rPr>
+          <w:rFonts w:ascii="Calibri" w:hAnsi="Calibri" w:eastAsia="Calibri"/>
+          <w:b w:val="0"/>
+          <w:i/>
+          <w:color w:val="646464"/>
+          <w:sz w:val="19"/>
+        </w:rPr>
+        <w:t>| 2026</w:t>
+      </w:r>
+    </w:p>
+    <w:p>
+      <w:pPr>
+        <w:autoSpaceDN w:val="0"/>
+        <w:tabs>
+          <w:tab w:pos="370" w:val="left"/>
+        </w:tabs>
+        <w:autoSpaceDE w:val="0"/>
+        <w:widowControl/>
+        <w:spacing w:line="245" w:lineRule="auto" w:before="42" w:after="0"/>
+        <w:ind w:left="10" w:right="0" w:firstLine="0"/>
+        <w:jc w:val="left"/>
+      </w:pPr>
+      <w:r>
+        <w:rPr>
+          <w:rFonts w:ascii="Symbol" w:hAnsi="Symbol" w:eastAsia="Symbol"/>
+          <w:b w:val="0"/>
+          <w:i w:val="0"/>
+          <w:color w:val="000000"/>
+          <w:sz w:val="20"/>
+        </w:rPr>
+        <w:t>•</w:t>
+      </w:r>
+      <w:r>
+        <w:tab/>
+      </w:r>
+      <w:r>
+        <w:rPr>
+          <w:rFonts w:ascii="Calibri" w:hAnsi="Calibri" w:eastAsia="Calibri"/>
+          <w:b w:val="0"/>
+          <w:i w:val="0"/>
+          <w:color w:val="000000"/>
+          <w:sz w:val="19"/>
+        </w:rPr>
+        <w:t xml:space="preserve">Engineered an embedded audit companion integrating 4 modules: RF scanning, Wi-Fi auditing, RSSI foxhunting, and USB-HID </w:t>
+      </w:r>
+    </w:p>
+    <w:p>
+      <w:pPr>
+        <w:autoSpaceDN w:val="0"/>
+        <w:autoSpaceDE w:val="0"/>
+        <w:widowControl/>
+        <w:spacing w:line="197" w:lineRule="auto" w:before="76" w:after="0"/>
+        <w:ind w:left="370" w:right="0" w:firstLine="0"/>
+        <w:jc w:val="left"/>
+      </w:pPr>
+      <w:r>
+        <w:rPr>
+          <w:rFonts w:ascii="Calibri" w:hAnsi="Calibri" w:eastAsia="Calibri"/>
+          <w:b w:val="0"/>
+          <w:i w:val="0"/>
+          <w:color w:val="000000"/>
+          <w:sz w:val="19"/>
+        </w:rPr>
+        <w:t>injection.</w:t>
+      </w:r>
+    </w:p>
+    <w:p>
+      <w:pPr>
+        <w:autoSpaceDN w:val="0"/>
+        <w:tabs>
+          <w:tab w:pos="370" w:val="left"/>
+        </w:tabs>
+        <w:autoSpaceDE w:val="0"/>
+        <w:widowControl/>
+        <w:spacing w:line="245" w:lineRule="auto" w:before="40" w:after="0"/>
+        <w:ind w:left="10" w:right="0" w:firstLine="0"/>
+        <w:jc w:val="left"/>
+      </w:pPr>
+      <w:r>
+        <w:rPr>
+          <w:rFonts w:ascii="Symbol" w:hAnsi="Symbol" w:eastAsia="Symbol"/>
+          <w:b w:val="0"/>
+          <w:i w:val="0"/>
+          <w:color w:val="000000"/>
+          <w:sz w:val="20"/>
+        </w:rPr>
+        <w:t>•</w:t>
+      </w:r>
+      <w:r>
+        <w:tab/>
+      </w:r>
+      <w:r>
+        <w:rPr>
+          <w:rFonts w:ascii="Calibri" w:hAnsi="Calibri" w:eastAsia="Calibri"/>
+          <w:b w:val="0"/>
+          <w:i w:val="0"/>
+          <w:color w:val="000000"/>
+          <w:sz w:val="19"/>
+        </w:rPr>
+        <w:t>Optimized display rendering to 60 FPS by pinning FreeRTOS tasks on dual CPU cores, cutting frame latency by 35%.</w:t>
+      </w:r>
+    </w:p>
+    <w:p>
+      <w:pPr>
+        <w:autoSpaceDN w:val="0"/>
+        <w:tabs>
+          <w:tab w:pos="370" w:val="left"/>
+        </w:tabs>
+        <w:autoSpaceDE w:val="0"/>
+        <w:widowControl/>
+        <w:spacing w:line="245" w:lineRule="auto" w:before="38" w:after="0"/>
+        <w:ind w:left="10" w:right="0" w:firstLine="0"/>
+        <w:jc w:val="left"/>
+      </w:pPr>
+      <w:r>
+        <w:rPr>
+          <w:rFonts w:ascii="Symbol" w:hAnsi="Symbol" w:eastAsia="Symbol"/>
+          <w:b w:val="0"/>
+          <w:i w:val="0"/>
+          <w:color w:val="000000"/>
+          <w:sz w:val="20"/>
+        </w:rPr>
+        <w:t>•</w:t>
+      </w:r>
+      <w:r>
+        <w:tab/>
+      </w:r>
+      <w:r>
+        <w:rPr>
+          <w:rFonts w:ascii="Calibri" w:hAnsi="Calibri" w:eastAsia="Calibri"/>
+          <w:b w:val="0"/>
+          <w:i w:val="0"/>
+          <w:color w:val="000000"/>
+          <w:sz w:val="19"/>
+        </w:rPr>
+        <w:t>Secured 2nd Prize at TECHTANTRA 2K26 national competition among 50+ teams.</w:t>
+      </w:r>
+    </w:p>
+    <w:p>
+      <w:pPr>
+        <w:autoSpaceDN w:val="0"/>
+        <w:autoSpaceDE w:val="0"/>
+        <w:widowControl/>
+        <w:spacing w:line="194" w:lineRule="auto" w:before="162" w:after="0"/>
+        <w:ind w:left="30" w:right="0" w:firstLine="0"/>
+        <w:jc w:val="left"/>
+      </w:pPr>
+      <w:r>
+        <w:rPr>
+          <w:rFonts w:ascii="Calibri" w:hAnsi="Calibri" w:eastAsia="Calibri"/>
+          <w:b/>
+          <w:i w:val="0"/>
+          <w:color w:val="000000"/>
+          <w:sz w:val="20"/>
+        </w:rPr>
+        <w:t>Sentinel - HID Attack Detection Framework</w:t>
+      </w:r>
+      <w:r>
+        <w:rPr>
+          <w:rFonts w:ascii="Calibri" w:hAnsi="Calibri" w:eastAsia="Calibri"/>
+          <w:b w:val="0"/>
+          <w:i/>
+          <w:color w:val="505050"/>
+          <w:sz w:val="19"/>
+        </w:rPr>
+        <w:t xml:space="preserve"> | Python, Windows API, WMI</w:t>
+      </w:r>
+      <w:r>
+        <w:rPr>
+          <w:rFonts w:ascii="Calibri" w:hAnsi="Calibri" w:eastAsia="Calibri"/>
           <w:b w:val="0"/>
           <w:i/>
           <w:color w:val="646464"/>
@@ -776,78 +1520,127 @@
     </w:p>
     <w:p>
       <w:pPr>
-        <w:pStyle w:val="ListBullet"/>
-        <w:spacing w:before="0" w:after="20"/>
-        <w:ind w:left="340"/>
+        <w:sectPr>
+          <w:pgSz w:w="12240" w:h="15840"/>
+          <w:pgMar w:top="320" w:right="798" w:bottom="346" w:left="820" w:header="720" w:footer="720" w:gutter="0"/>
+          <w:cols/>
+          <w:docGrid w:linePitch="360"/>
+        </w:sectPr>
+      </w:pPr>
+    </w:p>
+    <w:p>
+      <w:pPr>
+        <w:autoSpaceDN w:val="0"/>
+        <w:autoSpaceDE w:val="0"/>
+        <w:widowControl/>
+        <w:spacing w:line="220" w:lineRule="exact" w:before="0" w:after="66"/>
+        <w:ind w:left="0" w:right="0"/>
+      </w:pPr>
+    </w:p>
+    <w:p>
+      <w:pPr>
+        <w:autoSpaceDN w:val="0"/>
+        <w:tabs>
+          <w:tab w:pos="370" w:val="left"/>
+        </w:tabs>
+        <w:autoSpaceDE w:val="0"/>
+        <w:widowControl/>
+        <w:spacing w:line="245" w:lineRule="auto" w:before="0" w:after="0"/>
+        <w:ind w:left="10" w:right="0" w:firstLine="0"/>
+        <w:jc w:val="left"/>
       </w:pPr>
       <w:r>
         <w:rPr>
-          <w:rFonts w:ascii="Calibri" w:hAnsi="Calibri"/>
+          <w:rFonts w:ascii="Symbol" w:hAnsi="Symbol" w:eastAsia="Symbol"/>
           <w:b w:val="0"/>
           <w:i w:val="0"/>
+          <w:color w:val="000000"/>
+          <w:sz w:val="20"/>
+        </w:rPr>
+        <w:t>•</w:t>
+      </w:r>
+      <w:r>
+        <w:tab/>
+      </w:r>
+      <w:r>
+        <w:rPr>
+          <w:rFonts w:ascii="Calibri" w:hAnsi="Calibri" w:eastAsia="Calibri"/>
+          <w:b w:val="0"/>
+          <w:i w:val="0"/>
+          <w:color w:val="000000"/>
           <w:sz w:val="19"/>
         </w:rPr>
-        <w:t>Engineered an embedded security audit device integrating four modules for wireless scanning, signal analysis, and automated testing.</w:t>
+        <w:t>Developed a real-time USB threat detection system that neutralizes rogue HID devices within 10 milliseconds.</w:t>
       </w:r>
     </w:p>
     <w:p>
       <w:pPr>
-        <w:pStyle w:val="ListBullet"/>
-        <w:spacing w:before="0" w:after="20"/>
-        <w:ind w:left="340"/>
+        <w:autoSpaceDN w:val="0"/>
+        <w:tabs>
+          <w:tab w:pos="370" w:val="left"/>
+        </w:tabs>
+        <w:autoSpaceDE w:val="0"/>
+        <w:widowControl/>
+        <w:spacing w:line="245" w:lineRule="auto" w:before="38" w:after="0"/>
+        <w:ind w:left="10" w:right="0" w:firstLine="0"/>
+        <w:jc w:val="left"/>
       </w:pPr>
       <w:r>
         <w:rPr>
-          <w:rFonts w:ascii="Calibri" w:hAnsi="Calibri"/>
+          <w:rFonts w:ascii="Symbol" w:hAnsi="Symbol" w:eastAsia="Symbol"/>
           <w:b w:val="0"/>
           <w:i w:val="0"/>
+          <w:color w:val="000000"/>
+          <w:sz w:val="20"/>
+        </w:rPr>
+        <w:t>•</w:t>
+      </w:r>
+      <w:r>
+        <w:tab/>
+      </w:r>
+      <w:r>
+        <w:rPr>
+          <w:rFonts w:ascii="Calibri" w:hAnsi="Calibri" w:eastAsia="Calibri"/>
+          <w:b w:val="0"/>
+          <w:i w:val="0"/>
+          <w:color w:val="000000"/>
           <w:sz w:val="19"/>
         </w:rPr>
-        <w:t>Optimized graphical display rendering to 60 frames per second by distributing real-time tasks across dual processor cores.</w:t>
+        <w:t>Intercepted 100% of simulated BadUSB attack vectors via automated forensic snapshotting in controlled scenarios.</w:t>
       </w:r>
     </w:p>
     <w:p>
       <w:pPr>
-        <w:pStyle w:val="ListBullet"/>
-        <w:spacing w:before="0" w:after="20"/>
-        <w:ind w:left="340"/>
+        <w:autoSpaceDN w:val="0"/>
+        <w:autoSpaceDE w:val="0"/>
+        <w:widowControl/>
+        <w:spacing w:line="197" w:lineRule="auto" w:before="160" w:after="0"/>
+        <w:ind w:left="30" w:right="0" w:firstLine="0"/>
+        <w:jc w:val="left"/>
       </w:pPr>
       <w:r>
         <w:rPr>
-          <w:rFonts w:ascii="Calibri" w:hAnsi="Calibri"/>
-          <w:b w:val="0"/>
-          <w:i w:val="0"/>
-          <w:sz w:val="19"/>
-        </w:rPr>
-        <w:t>Secured second prize at a national technical competition among 50 participating teams for this project submission.</w:t>
-      </w:r>
-    </w:p>
-    <w:p>
-      <w:pPr>
-        <w:spacing w:before="80" w:after="0"/>
-      </w:pPr>
-      <w:r>
-        <w:rPr>
-          <w:rFonts w:ascii="Calibri" w:hAnsi="Calibri"/>
+          <w:rFonts w:ascii="Calibri" w:hAnsi="Calibri" w:eastAsia="Calibri"/>
           <w:b/>
           <w:i w:val="0"/>
+          <w:color w:val="000000"/>
           <w:sz w:val="20"/>
         </w:rPr>
-        <w:t>Sentinel - Attack Detection Framework</w:t>
+        <w:t>MicroFlasher - Web Serial Flashing Platform</w:t>
       </w:r>
       <w:r>
         <w:rPr>
-          <w:rFonts w:ascii="Calibri" w:hAnsi="Calibri"/>
+          <w:rFonts w:ascii="Calibri" w:hAnsi="Calibri" w:eastAsia="Calibri"/>
           <w:b w:val="0"/>
           <w:i/>
           <w:color w:val="505050"/>
           <w:sz w:val="19"/>
         </w:rPr>
-        <w:t xml:space="preserve"> | Python, Windows API</w:t>
+        <w:t xml:space="preserve"> | TypeScript, Web Serial API</w:t>
       </w:r>
       <w:r>
         <w:rPr>
-          <w:rFonts w:ascii="Calibri" w:hAnsi="Calibri"/>
+          <w:rFonts w:ascii="Calibri" w:hAnsi="Calibri" w:eastAsia="Calibri"/>
           <w:b w:val="0"/>
           <w:i/>
           <w:color w:val="646464"/>
@@ -858,102 +1651,62 @@
     </w:p>
     <w:p>
       <w:pPr>
-        <w:pStyle w:val="ListBullet"/>
-        <w:spacing w:before="0" w:after="20"/>
-        <w:ind w:left="340"/>
+        <w:autoSpaceDN w:val="0"/>
+        <w:tabs>
+          <w:tab w:pos="370" w:val="left"/>
+        </w:tabs>
+        <w:autoSpaceDE w:val="0"/>
+        <w:widowControl/>
+        <w:spacing w:line="245" w:lineRule="auto" w:before="40" w:after="0"/>
+        <w:ind w:left="10" w:right="0" w:firstLine="0"/>
+        <w:jc w:val="left"/>
       </w:pPr>
       <w:r>
         <w:rPr>
-          <w:rFonts w:ascii="Calibri" w:hAnsi="Calibri"/>
+          <w:rFonts w:ascii="Symbol" w:hAnsi="Symbol" w:eastAsia="Symbol"/>
           <w:b w:val="0"/>
           <w:i w:val="0"/>
+          <w:color w:val="000000"/>
+          <w:sz w:val="20"/>
+        </w:rPr>
+        <w:t>•</w:t>
+      </w:r>
+      <w:r>
+        <w:tab/>
+      </w:r>
+      <w:r>
+        <w:rPr>
+          <w:rFonts w:ascii="Calibri" w:hAnsi="Calibri" w:eastAsia="Calibri"/>
+          <w:b w:val="0"/>
+          <w:i w:val="0"/>
+          <w:color w:val="000000"/>
           <w:sz w:val="19"/>
         </w:rPr>
-        <w:t>Developed a real-time threat detection system that identifies and neutralizes rogue peripheral devices within 10 milliseconds.</w:t>
+        <w:t>Deployed a zero-install browser-based firmware flasher, reducing developer onboarding time by 70%.</w:t>
       </w:r>
     </w:p>
     <w:p>
       <w:pPr>
-        <w:pStyle w:val="ListBullet"/>
-        <w:spacing w:before="0" w:after="20"/>
-        <w:ind w:left="340"/>
+        <w:autoSpaceDN w:val="0"/>
+        <w:autoSpaceDE w:val="0"/>
+        <w:widowControl/>
+        <w:spacing w:line="197" w:lineRule="auto" w:before="160" w:after="0"/>
+        <w:ind w:left="30" w:right="0" w:firstLine="0"/>
+        <w:jc w:val="left"/>
       </w:pPr>
       <w:r>
         <w:rPr>
-          <w:rFonts w:ascii="Calibri" w:hAnsi="Calibri"/>
-          <w:b w:val="0"/>
-          <w:i w:val="0"/>
-          <w:sz w:val="19"/>
-        </w:rPr>
-        <w:t>Validated the framework against simulated attack scenarios, achieving a 100 percent detection rate in controlled test environments.</w:t>
-      </w:r>
-    </w:p>
-    <w:p>
-      <w:pPr>
-        <w:spacing w:before="80" w:after="0"/>
-      </w:pPr>
-      <w:r>
-        <w:rPr>
-          <w:rFonts w:ascii="Calibri" w:hAnsi="Calibri"/>
+          <w:rFonts w:ascii="Calibri" w:hAnsi="Calibri" w:eastAsia="Calibri"/>
           <w:b/>
           <w:i w:val="0"/>
-          <w:sz w:val="20"/>
-        </w:rPr>
-        <w:t>MicroFlasher - Web Serial Flashing Platform</w:t>
-      </w:r>
-      <w:r>
-        <w:rPr>
-          <w:rFonts w:ascii="Calibri" w:hAnsi="Calibri"/>
-          <w:b w:val="0"/>
-          <w:i/>
-          <w:color w:val="505050"/>
-          <w:sz w:val="19"/>
-        </w:rPr>
-        <w:t xml:space="preserve"> | TypeScript, Web Serial API</w:t>
-      </w:r>
-      <w:r>
-        <w:rPr>
-          <w:rFonts w:ascii="Calibri" w:hAnsi="Calibri"/>
-          <w:b w:val="0"/>
-          <w:i/>
-          <w:color w:val="646464"/>
-          <w:sz w:val="19"/>
-        </w:rPr>
-        <w:t xml:space="preserve"> | 2026</w:t>
-      </w:r>
-    </w:p>
-    <w:p>
-      <w:pPr>
-        <w:pStyle w:val="ListBullet"/>
-        <w:spacing w:before="0" w:after="20"/>
-        <w:ind w:left="340"/>
-      </w:pPr>
-      <w:r>
-        <w:rPr>
-          <w:rFonts w:ascii="Calibri" w:hAnsi="Calibri"/>
-          <w:b w:val="0"/>
-          <w:i w:val="0"/>
-          <w:sz w:val="19"/>
-        </w:rPr>
-        <w:t>Deployed a browser-based firmware installation tool that eliminated setup requirements, reducing onboarding time by 70 percent.</w:t>
-      </w:r>
-    </w:p>
-    <w:p>
-      <w:pPr>
-        <w:spacing w:before="80" w:after="0"/>
-      </w:pPr>
-      <w:r>
-        <w:rPr>
-          <w:rFonts w:ascii="Calibri" w:hAnsi="Calibri"/>
-          <w:b/>
-          <w:i w:val="0"/>
+          <w:color w:val="000000"/>
           <w:sz w:val="20"/>
         </w:rPr>
         <w:t>Autonomous Line-Follower Robot</w:t>
       </w:r>
       <w:r>
         <w:rPr>
-          <w:rFonts w:ascii="Calibri" w:hAnsi="Calibri"/>
+          <w:rFonts w:ascii="Calibri" w:hAnsi="Calibri" w:eastAsia="Calibri"/>
           <w:b w:val="0"/>
           <w:i/>
           <w:color w:val="505050"/>
@@ -962,72 +1715,148 @@
         <w:t xml:space="preserve"> | ATmega328P, L298N, IR Sensors</w:t>
       </w:r>
       <w:r>
-        <w:t xml:space="preserve"> | </w:t>
+        <w:rPr>
+          <w:rFonts w:ascii="Calibri" w:hAnsi="Calibri" w:eastAsia="Calibri"/>
+          <w:b w:val="0"/>
+          <w:i w:val="0"/>
+          <w:color w:val="000000"/>
+          <w:sz w:val="20"/>
+        </w:rPr>
+        <w:t xml:space="preserve"> |</w:t>
       </w:r>
-      <w:hyperlink r:id="rId14">
-        <w:r>
-          <w:rPr>
-            <w:color w:val="2980B9"/>
-            <w:u w:val="single"/>
-            <w:b/>
-            <w:rFonts w:ascii="Calibri" w:hAnsi="Calibri"/>
-            <w:sz w:val="18"/>
-          </w:rPr>
-          <w:t>[GitHub Repo]</w:t>
-        </w:r>
-      </w:hyperlink>
       <w:r>
         <w:rPr>
-          <w:rFonts w:ascii="Calibri" w:hAnsi="Calibri"/>
+          <w:rFonts w:ascii="Calibri" w:hAnsi="Calibri" w:eastAsia="Calibri"/>
+          <w:b w:val="0"/>
+          <w:i w:val="0"/>
+          <w:color w:val="000000"/>
+          <w:sz w:val="20"/>
+        </w:rPr>
+        <w:t xml:space="preserve"> </w:t>
+      </w:r>
+      <w:r>
+        <w:rPr>
+          <w:u w:val="single" w:color="2980b8"/>
+          <w:rFonts w:ascii="Calibri" w:hAnsi="Calibri" w:eastAsia="Calibri"/>
+          <w:b/>
+          <w:i w:val="0"/>
+          <w:color w:val="2980B9"/>
+          <w:sz w:val="18"/>
+        </w:rPr>
+        <w:hyperlink r:id="rId13" w:history="1">
+          <w:r>
+            <w:rPr>
+              <w:rStyle w:val="Hyperlink"/>
+            </w:rPr>
+            <w:t>[GitHub Repo]</w:t>
+          </w:r>
+        </w:hyperlink>
+      </w:r>
+      <w:r>
+        <w:rPr>
+          <w:rFonts w:ascii="Calibri" w:hAnsi="Calibri" w:eastAsia="Calibri"/>
           <w:b w:val="0"/>
           <w:i/>
           <w:color w:val="646464"/>
           <w:sz w:val="19"/>
         </w:rPr>
-        <w:t xml:space="preserve"> | 2025</w:t>
+        <w:t xml:space="preserve"> </w:t>
+      </w:r>
+      <w:r>
+        <w:rPr>
+          <w:rFonts w:ascii="Calibri" w:hAnsi="Calibri" w:eastAsia="Calibri"/>
+          <w:b w:val="0"/>
+          <w:i/>
+          <w:color w:val="646464"/>
+          <w:sz w:val="19"/>
+        </w:rPr>
+        <w:t>| 2025</w:t>
       </w:r>
     </w:p>
     <w:p>
       <w:pPr>
-        <w:pStyle w:val="ListBullet"/>
-        <w:spacing w:before="0" w:after="20"/>
-        <w:ind w:left="340"/>
+        <w:autoSpaceDN w:val="0"/>
+        <w:tabs>
+          <w:tab w:pos="370" w:val="left"/>
+        </w:tabs>
+        <w:autoSpaceDE w:val="0"/>
+        <w:widowControl/>
+        <w:spacing w:line="245" w:lineRule="auto" w:before="40" w:after="0"/>
+        <w:ind w:left="10" w:right="0" w:firstLine="0"/>
+        <w:jc w:val="left"/>
       </w:pPr>
       <w:r>
         <w:rPr>
-          <w:rFonts w:ascii="Calibri" w:hAnsi="Calibri"/>
+          <w:rFonts w:ascii="Symbol" w:hAnsi="Symbol" w:eastAsia="Symbol"/>
           <w:b w:val="0"/>
           <w:i w:val="0"/>
+          <w:color w:val="000000"/>
+          <w:sz w:val="20"/>
+        </w:rPr>
+        <w:t>•</w:t>
+      </w:r>
+      <w:r>
+        <w:tab/>
+      </w:r>
+      <w:r>
+        <w:rPr>
+          <w:rFonts w:ascii="Calibri" w:hAnsi="Calibri" w:eastAsia="Calibri"/>
+          <w:b w:val="0"/>
+          <w:i w:val="0"/>
+          <w:color w:val="000000"/>
           <w:sz w:val="19"/>
         </w:rPr>
-        <w:t>Constructed a differential-drive robot with precision motor calibration, eliminating stalling and reducing noise output by 90 percent.</w:t>
+        <w:t>Constructed a differential-drive robot with PWM calibration at 7.8 kHz, eliminating motor stalling and reducing noise by 90%.</w:t>
       </w:r>
     </w:p>
     <w:p>
       <w:pPr>
-        <w:pStyle w:val="ListBullet"/>
-        <w:spacing w:before="0" w:after="20"/>
-        <w:ind w:left="340"/>
+        <w:autoSpaceDN w:val="0"/>
+        <w:tabs>
+          <w:tab w:pos="370" w:val="left"/>
+        </w:tabs>
+        <w:autoSpaceDE w:val="0"/>
+        <w:widowControl/>
+        <w:spacing w:line="245" w:lineRule="auto" w:before="38" w:after="0"/>
+        <w:ind w:left="10" w:right="0" w:firstLine="0"/>
+        <w:jc w:val="left"/>
       </w:pPr>
       <w:r>
         <w:rPr>
-          <w:rFonts w:ascii="Calibri" w:hAnsi="Calibri"/>
+          <w:rFonts w:ascii="Symbol" w:hAnsi="Symbol" w:eastAsia="Symbol"/>
           <w:b w:val="0"/>
           <w:i w:val="0"/>
+          <w:color w:val="000000"/>
+          <w:sz w:val="20"/>
+        </w:rPr>
+        <w:t>•</w:t>
+      </w:r>
+      <w:r>
+        <w:tab/>
+      </w:r>
+      <w:r>
+        <w:rPr>
+          <w:rFonts w:ascii="Calibri" w:hAnsi="Calibri" w:eastAsia="Calibri"/>
+          <w:b w:val="0"/>
+          <w:i w:val="0"/>
+          <w:color w:val="000000"/>
           <w:sz w:val="19"/>
         </w:rPr>
-        <w:t>Calibrated a proportional control algorithm that achieved 95 percent path tracking accuracy on sharp turn sections.</w:t>
+        <w:t>Calibrated a proportional control algorithm achieving 95% path accuracy on sharp 90-degree corners.</w:t>
       </w:r>
     </w:p>
     <w:p>
       <w:pPr>
-        <w:pBdr>
-          <w:bottom w:val="single" w:sz="4" w:space="1" w:color="000000"/>
-        </w:pBdr>
+        <w:autoSpaceDN w:val="0"/>
+        <w:autoSpaceDE w:val="0"/>
+        <w:widowControl/>
+        <w:spacing w:line="197" w:lineRule="auto" w:before="100" w:after="64"/>
+        <w:ind w:left="30" w:right="0" w:firstLine="0"/>
+        <w:jc w:val="left"/>
       </w:pPr>
       <w:r>
         <w:rPr>
-          <w:rFonts w:ascii="Calibri" w:hAnsi="Calibri"/>
+          <w:rFonts w:ascii="Calibri" w:hAnsi="Calibri" w:eastAsia="Calibri"/>
           <w:b/>
           <w:i w:val="0"/>
           <w:color w:val="000000"/>
@@ -1036,47 +1865,122 @@
         <w:t>ACHIEVEMENTS</w:t>
       </w:r>
     </w:p>
+    <w:tbl>
+      <w:tblPr>
+        <w:tblW w:type="auto" w:w="0"/>
+        <w:tblLayout w:type="fixed"/>
+        <w:tblLook w:firstColumn="1" w:firstRow="1" w:lastColumn="0" w:lastRow="0" w:noHBand="0" w:noVBand="1" w:val="04A0"/>
+        <w:tblInd w:w="0.0" w:type="dxa"/>
+      </w:tblPr>
+      <w:tblGrid>
+        <w:gridCol w:w="5311"/>
+        <w:gridCol w:w="5311"/>
+      </w:tblGrid>
+      <w:tr>
+        <w:trPr>
+          <w:trHeight w:hRule="exact" w:val="792"/>
+        </w:trPr>
+        <w:tc>
+          <w:tcPr>
+            <w:tcW w:type="dxa" w:w="220"/>
+            <w:tcBorders>
+              <w:top w:sz="4.0" w:val="single" w:color="#000000"/>
+            </w:tcBorders>
+            <w:tcMar>
+              <w:start w:w="0" w:type="dxa"/>
+              <w:end w:w="0" w:type="dxa"/>
+            </w:tcMar>
+          </w:tcPr>
+          <w:p>
+            <w:pPr>
+              <w:autoSpaceDN w:val="0"/>
+              <w:autoSpaceDE w:val="0"/>
+              <w:widowControl/>
+              <w:spacing w:line="259" w:lineRule="auto" w:before="204" w:after="0"/>
+              <w:ind w:left="10" w:right="0" w:firstLine="0"/>
+              <w:jc w:val="left"/>
+            </w:pPr>
+            <w:r>
+              <w:rPr>
+                <w:rFonts w:ascii="Symbol" w:hAnsi="Symbol" w:eastAsia="Symbol"/>
+                <w:b w:val="0"/>
+                <w:i w:val="0"/>
+                <w:color w:val="000000"/>
+                <w:sz w:val="20"/>
+              </w:rPr>
+              <w:t>•</w:t>
+            </w:r>
+            <w:r>
+              <w:br/>
+            </w:r>
+            <w:r>
+              <w:rPr>
+                <w:rFonts w:ascii="Symbol" w:hAnsi="Symbol" w:eastAsia="Symbol"/>
+                <w:b w:val="0"/>
+                <w:i w:val="0"/>
+                <w:color w:val="000000"/>
+                <w:sz w:val="20"/>
+              </w:rPr>
+              <w:t>•</w:t>
+            </w:r>
+          </w:p>
+        </w:tc>
+        <w:tc>
+          <w:tcPr>
+            <w:tcW w:type="dxa" w:w="10382"/>
+            <w:tcBorders>
+              <w:top w:sz="4.0" w:val="single" w:color="#000000"/>
+            </w:tcBorders>
+            <w:tcMar>
+              <w:start w:w="0" w:type="dxa"/>
+              <w:end w:w="0" w:type="dxa"/>
+            </w:tcMar>
+          </w:tcPr>
+          <w:p>
+            <w:pPr>
+              <w:autoSpaceDN w:val="0"/>
+              <w:autoSpaceDE w:val="0"/>
+              <w:widowControl/>
+              <w:spacing w:line="245" w:lineRule="auto" w:before="262" w:after="0"/>
+              <w:ind w:left="150" w:right="1008" w:firstLine="0"/>
+              <w:jc w:val="left"/>
+            </w:pPr>
+            <w:r>
+              <w:rPr>
+                <w:rFonts w:ascii="Calibri" w:hAnsi="Calibri" w:eastAsia="Calibri"/>
+                <w:b w:val="0"/>
+                <w:i w:val="0"/>
+                <w:color w:val="000000"/>
+                <w:sz w:val="19"/>
+              </w:rPr>
+              <w:t xml:space="preserve">Won 2nd Prize at TECHTANTRA 2K26 National Level Technical Competition among 50+ teams for the ZeroTrace project. </w:t>
+            </w:r>
+            <w:r>
+              <w:rPr>
+                <w:rFonts w:ascii="Calibri" w:hAnsi="Calibri" w:eastAsia="Calibri"/>
+                <w:b w:val="0"/>
+                <w:i w:val="0"/>
+                <w:color w:val="000000"/>
+                <w:sz w:val="19"/>
+              </w:rPr>
+              <w:t>Filed Indian Design Patent (Application No. 499678-001, CBR No. 209757) in April 2026 for ZeroTrace hardware.</w:t>
+            </w:r>
+          </w:p>
+        </w:tc>
+      </w:tr>
+    </w:tbl>
     <w:p>
       <w:pPr>
-        <w:pStyle w:val="ListBullet"/>
-        <w:spacing w:before="0" w:after="20"/>
-        <w:ind w:left="340"/>
+        <w:autoSpaceDN w:val="0"/>
+        <w:autoSpaceDE w:val="0"/>
+        <w:widowControl/>
+        <w:spacing w:line="197" w:lineRule="auto" w:before="46" w:after="0"/>
+        <w:ind w:left="30" w:right="0" w:firstLine="0"/>
+        <w:jc w:val="left"/>
       </w:pPr>
       <w:r>
         <w:rPr>
-          <w:rFonts w:ascii="Calibri" w:hAnsi="Calibri"/>
-          <w:b w:val="0"/>
-          <w:i w:val="0"/>
-          <w:sz w:val="19"/>
-        </w:rPr>
-        <w:t>Won second prize at the national level technical competition among 50 teams for the embedded security device project.</w:t>
-      </w:r>
-    </w:p>
-    <w:p>
-      <w:pPr>
-        <w:pStyle w:val="ListBullet"/>
-        <w:spacing w:before="0" w:after="20"/>
-        <w:ind w:left="340"/>
-      </w:pPr>
-      <w:r>
-        <w:rPr>
-          <w:rFonts w:ascii="Calibri" w:hAnsi="Calibri"/>
-          <w:b w:val="0"/>
-          <w:i w:val="0"/>
-          <w:sz w:val="19"/>
-        </w:rPr>
-        <w:t>Filed an Indian Design Patent in April 2026 for original hardware design work on the cybersecurity audit device.</w:t>
-      </w:r>
-    </w:p>
-    <w:p>
-      <w:pPr>
-        <w:pBdr>
-          <w:bottom w:val="single" w:sz="4" w:space="1" w:color="000000"/>
-        </w:pBdr>
-      </w:pPr>
-      <w:r>
-        <w:rPr>
-          <w:rFonts w:ascii="Calibri" w:hAnsi="Calibri"/>
+          <w:rFonts w:ascii="Calibri" w:hAnsi="Calibri" w:eastAsia="Calibri"/>
           <w:b/>
           <w:i w:val="0"/>
           <w:color w:val="000000"/>
@@ -1087,20 +1991,26 @@
     </w:p>
     <w:p>
       <w:pPr>
-        <w:spacing w:before="80" w:after="0"/>
+        <w:autoSpaceDN w:val="0"/>
+        <w:autoSpaceDE w:val="0"/>
+        <w:widowControl/>
+        <w:spacing w:line="197" w:lineRule="auto" w:before="316" w:after="0"/>
+        <w:ind w:left="30" w:right="0" w:firstLine="0"/>
+        <w:jc w:val="left"/>
       </w:pPr>
       <w:r>
         <w:rPr>
-          <w:rFonts w:ascii="Calibri" w:hAnsi="Calibri"/>
+          <w:rFonts w:ascii="Calibri" w:hAnsi="Calibri" w:eastAsia="Calibri"/>
           <w:b/>
           <w:i w:val="0"/>
+          <w:color w:val="000000"/>
           <w:sz w:val="20"/>
         </w:rPr>
         <w:t>Bachelor of Technology in Computer Science and Engineering</w:t>
       </w:r>
       <w:r>
         <w:rPr>
-          <w:rFonts w:ascii="Calibri" w:hAnsi="Calibri"/>
+          <w:rFonts w:ascii="Calibri" w:hAnsi="Calibri" w:eastAsia="Calibri"/>
           <w:b w:val="0"/>
           <w:i/>
           <w:color w:val="505050"/>
@@ -1110,7 +2020,7 @@
       </w:r>
       <w:r>
         <w:rPr>
-          <w:rFonts w:ascii="Calibri" w:hAnsi="Calibri"/>
+          <w:rFonts w:ascii="Calibri" w:hAnsi="Calibri" w:eastAsia="Calibri"/>
           <w:b w:val="0"/>
           <w:i/>
           <w:color w:val="646464"/>
@@ -1121,35 +2031,46 @@
     </w:p>
     <w:p>
       <w:pPr>
-        <w:spacing w:after="20"/>
-        <w:ind w:left="170"/>
+        <w:autoSpaceDN w:val="0"/>
+        <w:autoSpaceDE w:val="0"/>
+        <w:widowControl/>
+        <w:spacing w:line="197" w:lineRule="auto" w:before="76" w:after="0"/>
+        <w:ind w:left="200" w:right="0" w:firstLine="0"/>
+        <w:jc w:val="left"/>
       </w:pPr>
       <w:r>
         <w:rPr>
-          <w:rFonts w:ascii="Calibri" w:hAnsi="Calibri"/>
+          <w:rFonts w:ascii="Calibri" w:hAnsi="Calibri" w:eastAsia="Calibri"/>
           <w:b w:val="0"/>
           <w:i/>
+          <w:color w:val="000000"/>
           <w:sz w:val="18"/>
         </w:rPr>
-        <w:t>Relevant Coursework: Data Structures, Computer Networks, Operating Systems, Embedded Systems, Cybersecurity</w:t>
+        <w:t>Specialization: IoT Architecture, Cybersecurity, Embedded Systems</w:t>
       </w:r>
     </w:p>
     <w:p>
       <w:pPr>
-        <w:spacing w:before="80" w:after="0"/>
+        <w:autoSpaceDN w:val="0"/>
+        <w:autoSpaceDE w:val="0"/>
+        <w:widowControl/>
+        <w:spacing w:line="194" w:lineRule="auto" w:before="160" w:after="0"/>
+        <w:ind w:left="30" w:right="0" w:firstLine="0"/>
+        <w:jc w:val="left"/>
       </w:pPr>
       <w:r>
         <w:rPr>
-          <w:rFonts w:ascii="Calibri" w:hAnsi="Calibri"/>
+          <w:rFonts w:ascii="Calibri" w:hAnsi="Calibri" w:eastAsia="Calibri"/>
           <w:b/>
           <w:i w:val="0"/>
+          <w:color w:val="000000"/>
           <w:sz w:val="20"/>
         </w:rPr>
-        <w:t>Higher Secondary Certificate in Science</w:t>
+        <w:t>Higher Secondary Certificate (HSC), Science</w:t>
       </w:r>
       <w:r>
         <w:rPr>
-          <w:rFonts w:ascii="Calibri" w:hAnsi="Calibri"/>
+          <w:rFonts w:ascii="Calibri" w:hAnsi="Calibri" w:eastAsia="Calibri"/>
           <w:b w:val="0"/>
           <w:i/>
           <w:color w:val="505050"/>
@@ -1159,7 +2080,7 @@
       </w:r>
       <w:r>
         <w:rPr>
-          <w:rFonts w:ascii="Calibri" w:hAnsi="Calibri"/>
+          <w:rFonts w:ascii="Calibri" w:hAnsi="Calibri" w:eastAsia="Calibri"/>
           <w:b w:val="0"/>
           <w:i/>
           <w:color w:val="646464"/>
@@ -1170,20 +2091,26 @@
     </w:p>
     <w:p>
       <w:pPr>
-        <w:spacing w:before="80" w:after="0"/>
+        <w:autoSpaceDN w:val="0"/>
+        <w:autoSpaceDE w:val="0"/>
+        <w:widowControl/>
+        <w:spacing w:line="194" w:lineRule="auto" w:before="162" w:after="0"/>
+        <w:ind w:left="30" w:right="0" w:firstLine="0"/>
+        <w:jc w:val="left"/>
       </w:pPr>
       <w:r>
         <w:rPr>
-          <w:rFonts w:ascii="Calibri" w:hAnsi="Calibri"/>
+          <w:rFonts w:ascii="Calibri" w:hAnsi="Calibri" w:eastAsia="Calibri"/>
           <w:b/>
           <w:i w:val="0"/>
+          <w:color w:val="000000"/>
           <w:sz w:val="20"/>
         </w:rPr>
-        <w:t>Secondary School Certificate with Distinction</w:t>
+        <w:t>Secondary School Certificate (SSC), Distinction</w:t>
       </w:r>
       <w:r>
         <w:rPr>
-          <w:rFonts w:ascii="Calibri" w:hAnsi="Calibri"/>
+          <w:rFonts w:ascii="Calibri" w:hAnsi="Calibri" w:eastAsia="Calibri"/>
           <w:b w:val="0"/>
           <w:i/>
           <w:color w:val="505050"/>
@@ -1193,7 +2120,7 @@
       </w:r>
       <w:r>
         <w:rPr>
-          <w:rFonts w:ascii="Calibri" w:hAnsi="Calibri"/>
+          <w:rFonts w:ascii="Calibri" w:hAnsi="Calibri" w:eastAsia="Calibri"/>
           <w:b w:val="0"/>
           <w:i/>
           <w:color w:val="646464"/>
@@ -1204,13 +2131,16 @@
     </w:p>
     <w:p>
       <w:pPr>
-        <w:pBdr>
-          <w:bottom w:val="single" w:sz="4" w:space="1" w:color="000000"/>
-        </w:pBdr>
+        <w:autoSpaceDN w:val="0"/>
+        <w:autoSpaceDE w:val="0"/>
+        <w:widowControl/>
+        <w:spacing w:line="197" w:lineRule="auto" w:before="82" w:after="0"/>
+        <w:ind w:left="30" w:right="0" w:firstLine="0"/>
+        <w:jc w:val="left"/>
       </w:pPr>
       <w:r>
         <w:rPr>
-          <w:rFonts w:ascii="Calibri" w:hAnsi="Calibri"/>
+          <w:rFonts w:ascii="Calibri" w:hAnsi="Calibri" w:eastAsia="Calibri"/>
           <w:b/>
           <w:i w:val="0"/>
           <w:color w:val="000000"/>
@@ -1221,71 +2151,86 @@
     </w:p>
     <w:p>
       <w:pPr>
-        <w:spacing w:before="0" w:after="20"/>
-        <w:ind w:left="170"/>
+        <w:autoSpaceDN w:val="0"/>
+        <w:autoSpaceDE w:val="0"/>
+        <w:widowControl/>
+        <w:spacing w:line="197" w:lineRule="auto" w:before="314" w:after="0"/>
+        <w:ind w:left="200" w:right="0" w:firstLine="0"/>
+        <w:jc w:val="left"/>
       </w:pPr>
       <w:r>
         <w:rPr>
-          <w:rFonts w:ascii="Calibri" w:hAnsi="Calibri"/>
+          <w:rFonts w:ascii="Calibri" w:hAnsi="Calibri" w:eastAsia="Calibri"/>
           <w:b/>
           <w:i w:val="0"/>
+          <w:color w:val="000000"/>
           <w:sz w:val="18"/>
         </w:rPr>
         <w:t>Cyber Security Workshop</w:t>
       </w:r>
       <w:r>
         <w:rPr>
-          <w:rFonts w:ascii="Calibri" w:hAnsi="Calibri"/>
+          <w:rFonts w:ascii="Calibri" w:hAnsi="Calibri" w:eastAsia="Calibri"/>
           <w:b w:val="0"/>
           <w:i/>
           <w:color w:val="646464"/>
           <w:sz w:val="18"/>
         </w:rPr>
-        <w:t xml:space="preserve"> - Craw Security and IIT Bombay, 2026</w:t>
+        <w:t xml:space="preserve"> - Craw Security and IIT Bombay, 2025-2026</w:t>
       </w:r>
     </w:p>
     <w:p>
       <w:pPr>
-        <w:spacing w:before="0" w:after="20"/>
-        <w:ind w:left="170"/>
+        <w:autoSpaceDN w:val="0"/>
+        <w:autoSpaceDE w:val="0"/>
+        <w:widowControl/>
+        <w:spacing w:line="197" w:lineRule="auto" w:before="90" w:after="0"/>
+        <w:ind w:left="200" w:right="0" w:firstLine="0"/>
+        <w:jc w:val="left"/>
       </w:pPr>
       <w:r>
         <w:rPr>
-          <w:rFonts w:ascii="Calibri" w:hAnsi="Calibri"/>
+          <w:rFonts w:ascii="Calibri" w:hAnsi="Calibri" w:eastAsia="Calibri"/>
           <w:b/>
           <w:i w:val="0"/>
+          <w:color w:val="000000"/>
           <w:sz w:val="18"/>
         </w:rPr>
         <w:t>Ethical Hacking and Penetration Testing</w:t>
       </w:r>
       <w:r>
         <w:rPr>
-          <w:rFonts w:ascii="Calibri" w:hAnsi="Calibri"/>
+          <w:rFonts w:ascii="Calibri" w:hAnsi="Calibri" w:eastAsia="Calibri"/>
           <w:b w:val="0"/>
           <w:i/>
           <w:color w:val="646464"/>
           <w:sz w:val="18"/>
         </w:rPr>
-        <w:t xml:space="preserve"> - NASSCOM FutureSkills Prime, 2026</w:t>
+        <w:t xml:space="preserve"> - NASSCOM FutureSkills Prime, 2025-2026</w:t>
       </w:r>
     </w:p>
     <w:p>
       <w:pPr>
-        <w:spacing w:before="0" w:after="20"/>
-        <w:ind w:left="170"/>
+        <w:autoSpaceDN w:val="0"/>
+        <w:autoSpaceDE w:val="0"/>
+        <w:widowControl/>
+        <w:spacing w:line="197" w:lineRule="auto" w:before="94" w:after="0"/>
+        <w:ind w:left="200" w:right="0" w:firstLine="0"/>
+        <w:jc w:val="left"/>
       </w:pPr>
       <w:r>
         <w:rPr>
-          <w:rFonts w:ascii="Calibri" w:hAnsi="Calibri"/>
+          <w:rFonts w:ascii="Calibri" w:hAnsi="Calibri" w:eastAsia="Calibri"/>
           <w:b/>
           <w:i w:val="0"/>
+          <w:color w:val="000000"/>
           <w:sz w:val="18"/>
         </w:rPr>
         <w:t>Security Operations Fundamentals</w:t>
       </w:r>
       <w:r>
         <w:rPr>
-          <w:rFonts w:ascii="Calibri" w:hAnsi="Calibri"/>
+          <w:rFonts w:ascii="Calibri" w:hAnsi="Calibri" w:eastAsia="Calibri"/>
           <w:b w:val="0"/>
           <w:i/>
           <w:color w:val="646464"/>
@@ -1296,21 +2241,26 @@
     </w:p>
     <w:p>
       <w:pPr>
-        <w:spacing w:before="0" w:after="20"/>
-        <w:ind w:left="170"/>
+        <w:autoSpaceDN w:val="0"/>
+        <w:autoSpaceDE w:val="0"/>
+        <w:widowControl/>
+        <w:spacing w:line="197" w:lineRule="auto" w:before="94" w:after="0"/>
+        <w:ind w:left="200" w:right="0" w:firstLine="0"/>
+        <w:jc w:val="left"/>
       </w:pPr>
       <w:r>
         <w:rPr>
-          <w:rFonts w:ascii="Calibri" w:hAnsi="Calibri"/>
+          <w:rFonts w:ascii="Calibri" w:hAnsi="Calibri" w:eastAsia="Calibri"/>
           <w:b/>
           <w:i w:val="0"/>
+          <w:color w:val="000000"/>
           <w:sz w:val="18"/>
         </w:rPr>
         <w:t>Network Security Fundamentals</w:t>
       </w:r>
       <w:r>
         <w:rPr>
-          <w:rFonts w:ascii="Calibri" w:hAnsi="Calibri"/>
+          <w:rFonts w:ascii="Calibri" w:hAnsi="Calibri" w:eastAsia="Calibri"/>
           <w:b w:val="0"/>
           <w:i/>
           <w:color w:val="646464"/>
@@ -1321,21 +2271,26 @@
     </w:p>
     <w:p>
       <w:pPr>
-        <w:spacing w:before="0" w:after="20"/>
-        <w:ind w:left="170"/>
+        <w:autoSpaceDN w:val="0"/>
+        <w:autoSpaceDE w:val="0"/>
+        <w:widowControl/>
+        <w:spacing w:line="197" w:lineRule="auto" w:before="92" w:after="0"/>
+        <w:ind w:left="200" w:right="0" w:firstLine="0"/>
+        <w:jc w:val="left"/>
       </w:pPr>
       <w:r>
         <w:rPr>
-          <w:rFonts w:ascii="Calibri" w:hAnsi="Calibri"/>
+          <w:rFonts w:ascii="Calibri" w:hAnsi="Calibri" w:eastAsia="Calibri"/>
           <w:b/>
           <w:i w:val="0"/>
+          <w:color w:val="000000"/>
           <w:sz w:val="18"/>
         </w:rPr>
         <w:t>Cybersecurity Fundamentals</w:t>
       </w:r>
       <w:r>
         <w:rPr>
-          <w:rFonts w:ascii="Calibri" w:hAnsi="Calibri"/>
+          <w:rFonts w:ascii="Calibri" w:hAnsi="Calibri" w:eastAsia="Calibri"/>
           <w:b w:val="0"/>
           <w:i/>
           <w:color w:val="646464"/>
@@ -1346,21 +2301,26 @@
     </w:p>
     <w:p>
       <w:pPr>
-        <w:spacing w:before="0" w:after="20"/>
-        <w:ind w:left="170"/>
+        <w:autoSpaceDN w:val="0"/>
+        <w:autoSpaceDE w:val="0"/>
+        <w:widowControl/>
+        <w:spacing w:line="197" w:lineRule="auto" w:before="92" w:after="0"/>
+        <w:ind w:left="200" w:right="0" w:firstLine="0"/>
+        <w:jc w:val="left"/>
       </w:pPr>
       <w:r>
         <w:rPr>
-          <w:rFonts w:ascii="Calibri" w:hAnsi="Calibri"/>
+          <w:rFonts w:ascii="Calibri" w:hAnsi="Calibri" w:eastAsia="Calibri"/>
           <w:b/>
           <w:i w:val="0"/>
+          <w:color w:val="000000"/>
           <w:sz w:val="18"/>
         </w:rPr>
         <w:t>Cloud Security Fundamentals</w:t>
       </w:r>
       <w:r>
         <w:rPr>
-          <w:rFonts w:ascii="Calibri" w:hAnsi="Calibri"/>
+          <w:rFonts w:ascii="Calibri" w:hAnsi="Calibri" w:eastAsia="Calibri"/>
           <w:b w:val="0"/>
           <w:i/>
           <w:color w:val="646464"/>
@@ -1371,21 +2331,26 @@
     </w:p>
     <w:p>
       <w:pPr>
-        <w:spacing w:before="0" w:after="20"/>
-        <w:ind w:left="170"/>
+        <w:autoSpaceDN w:val="0"/>
+        <w:autoSpaceDE w:val="0"/>
+        <w:widowControl/>
+        <w:spacing w:line="197" w:lineRule="auto" w:before="92" w:after="0"/>
+        <w:ind w:left="200" w:right="0" w:firstLine="0"/>
+        <w:jc w:val="left"/>
       </w:pPr>
       <w:r>
         <w:rPr>
-          <w:rFonts w:ascii="Calibri" w:hAnsi="Calibri"/>
+          <w:rFonts w:ascii="Calibri" w:hAnsi="Calibri" w:eastAsia="Calibri"/>
           <w:b/>
           <w:i w:val="0"/>
+          <w:color w:val="000000"/>
           <w:sz w:val="18"/>
         </w:rPr>
-        <w:t>Python Programming</w:t>
+        <w:t>Python Basic and Problem Solving</w:t>
       </w:r>
       <w:r>
         <w:rPr>
-          <w:rFonts w:ascii="Calibri" w:hAnsi="Calibri"/>
+          <w:rFonts w:ascii="Calibri" w:hAnsi="Calibri" w:eastAsia="Calibri"/>
           <w:b w:val="0"/>
           <w:i/>
           <w:color w:val="646464"/>
@@ -1396,21 +2361,26 @@
     </w:p>
     <w:p>
       <w:pPr>
-        <w:spacing w:before="0" w:after="20"/>
-        <w:ind w:left="170"/>
+        <w:autoSpaceDN w:val="0"/>
+        <w:autoSpaceDE w:val="0"/>
+        <w:widowControl/>
+        <w:spacing w:line="197" w:lineRule="auto" w:before="94" w:after="0"/>
+        <w:ind w:left="200" w:right="0" w:firstLine="0"/>
+        <w:jc w:val="left"/>
       </w:pPr>
       <w:r>
         <w:rPr>
-          <w:rFonts w:ascii="Calibri" w:hAnsi="Calibri"/>
+          <w:rFonts w:ascii="Calibri" w:hAnsi="Calibri" w:eastAsia="Calibri"/>
           <w:b/>
           <w:i w:val="0"/>
+          <w:color w:val="000000"/>
           <w:sz w:val="18"/>
         </w:rPr>
-        <w:t>Cloud Computing Fundamentals</w:t>
+        <w:t>AWS Cloud Computing Fundamentals</w:t>
       </w:r>
       <w:r>
         <w:rPr>
-          <w:rFonts w:ascii="Calibri" w:hAnsi="Calibri"/>
+          <w:rFonts w:ascii="Calibri" w:hAnsi="Calibri" w:eastAsia="Calibri"/>
           <w:b w:val="0"/>
           <w:i/>
           <w:color w:val="646464"/>
@@ -1421,21 +2391,26 @@
     </w:p>
     <w:p>
       <w:pPr>
-        <w:spacing w:before="0" w:after="20"/>
-        <w:ind w:left="170"/>
+        <w:autoSpaceDN w:val="0"/>
+        <w:autoSpaceDE w:val="0"/>
+        <w:widowControl/>
+        <w:spacing w:line="197" w:lineRule="auto" w:before="94" w:after="0"/>
+        <w:ind w:left="200" w:right="0" w:firstLine="0"/>
+        <w:jc w:val="left"/>
       </w:pPr>
       <w:r>
         <w:rPr>
-          <w:rFonts w:ascii="Calibri" w:hAnsi="Calibri"/>
+          <w:rFonts w:ascii="Calibri" w:hAnsi="Calibri" w:eastAsia="Calibri"/>
           <w:b/>
           <w:i w:val="0"/>
+          <w:color w:val="000000"/>
           <w:sz w:val="18"/>
         </w:rPr>
         <w:t>German Language Proficiency Level 1</w:t>
       </w:r>
       <w:r>
         <w:rPr>
-          <w:rFonts w:ascii="Calibri" w:hAnsi="Calibri"/>
+          <w:rFonts w:ascii="Calibri" w:hAnsi="Calibri" w:eastAsia="Calibri"/>
           <w:b w:val="0"/>
           <w:i/>
           <w:color w:val="646464"/>
@@ -1446,13 +2421,16 @@
     </w:p>
     <w:p>
       <w:pPr>
-        <w:pBdr>
-          <w:bottom w:val="single" w:sz="4" w:space="1" w:color="000000"/>
-        </w:pBdr>
+        <w:autoSpaceDN w:val="0"/>
+        <w:autoSpaceDE w:val="0"/>
+        <w:widowControl/>
+        <w:spacing w:line="197" w:lineRule="auto" w:before="96" w:after="0"/>
+        <w:ind w:left="30" w:right="0" w:firstLine="0"/>
+        <w:jc w:val="left"/>
       </w:pPr>
       <w:r>
         <w:rPr>
-          <w:rFonts w:ascii="Calibri" w:hAnsi="Calibri"/>
+          <w:rFonts w:ascii="Calibri" w:hAnsi="Calibri" w:eastAsia="Calibri"/>
           <w:b/>
           <w:i w:val="0"/>
           <w:color w:val="000000"/>
@@ -1463,53 +2441,28 @@
     </w:p>
     <w:p>
       <w:pPr>
-        <w:ind w:left="170"/>
+        <w:autoSpaceDN w:val="0"/>
+        <w:autoSpaceDE w:val="0"/>
+        <w:widowControl/>
+        <w:spacing w:line="197" w:lineRule="auto" w:before="312" w:after="0"/>
+        <w:ind w:left="200" w:right="0" w:firstLine="0"/>
+        <w:jc w:val="left"/>
       </w:pPr>
       <w:r>
         <w:rPr>
-          <w:rFonts w:ascii="Calibri" w:hAnsi="Calibri"/>
+          <w:rFonts w:ascii="Calibri" w:hAnsi="Calibri" w:eastAsia="Calibri"/>
           <w:b w:val="0"/>
           <w:i w:val="0"/>
+          <w:color w:val="000000"/>
           <w:sz w:val="19"/>
         </w:rPr>
         <w:t>English (Professional) | Hindi (Native) | Marathi (Native) | German (Beginner)</w:t>
       </w:r>
     </w:p>
-    <w:p>
-      <w:pPr>
-        <w:pBdr>
-          <w:bottom w:val="single" w:sz="4" w:space="1" w:color="000000"/>
-        </w:pBdr>
-      </w:pPr>
-      <w:r>
-        <w:rPr>
-          <w:rFonts w:ascii="Calibri" w:hAnsi="Calibri"/>
-          <w:b/>
-          <w:i w:val="0"/>
-          <w:color w:val="000000"/>
-          <w:sz w:val="22"/>
-        </w:rPr>
-        <w:t>INTERESTS</w:t>
-      </w:r>
-    </w:p>
-    <w:p>
-      <w:pPr>
-        <w:ind w:left="170"/>
-      </w:pPr>
-      <w:r>
-        <w:rPr>
-          <w:rFonts w:ascii="Calibri" w:hAnsi="Calibri"/>
-          <w:b w:val="0"/>
-          <w:i w:val="0"/>
-          <w:sz w:val="19"/>
-        </w:rPr>
-        <w:t>Embedded Systems Design, Hardware Security Research, Open Source Development, Competitive Robotics, Technical Writing</w:t>
-      </w:r>
-    </w:p>
     <w:sectPr>
       <w:pgSz w:w="12240" w:h="15840"/>
-      <w:pgMar w:top="567" w:right="850" w:bottom="567" w:left="850" w:header="720" w:footer="720" w:gutter="0"/>
-      <w:cols w:space="720"/>
+      <w:pgMar w:top="284" w:right="798" w:bottom="1440" w:left="820" w:header="720" w:footer="720" w:gutter="0"/>
+      <w:cols/>
       <w:docGrid w:linePitch="360"/>
     </w:sectPr>
   </w:body>
@@ -1879,10 +2832,6 @@
     <w:name w:val="Normal"/>
     <w:qFormat/>
     <w:rsid w:val="00FC693F"/>
-    <w:rPr>
-      <w:rFonts w:ascii="Calibri" w:hAnsi="Calibri"/>
-      <w:sz w:val="20"/>
-    </w:rPr>
   </w:style>
   <w:style w:type="paragraph" w:styleId="Header">
     <w:name w:val="header"/>

</xml_diff>